<commit_message>
Docx report: add multi-dataset section (capability curve, SR matrix, confidence detection)
</commit_message>
<xml_diff>
--- a/docs/CREST_Experimental_Record.docx
+++ b/docs/CREST_Experimental_Record.docx
@@ -45,7 +45,7 @@
           <w:sz w:val="22"/>
           <w:szCs w:val="22"/>
         </w:rPr>
-        <w:t xml:space="preserve">Experimental Record and Decision Log — Phases 1–4, three models</w:t>
+        <w:t xml:space="preserve">Experimental Record and Decision Log — Phases 1–4, 3 datasets × 3 models</w:t>
       </w:r>
     </w:p>
     <w:p>
@@ -85,7 +85,7 @@
           <w:sz w:val="20"/>
           <w:szCs w:val="20"/>
         </w:rPr>
-        <w:t xml:space="preserve">Compiled 24 July 2026</w:t>
+        <w:t xml:space="preserve">Compiled 27 July 2026</w:t>
       </w:r>
     </w:p>
     <w:tbl>
@@ -8574,6 +8574,4073 @@
                 <w:szCs w:val="20"/>
               </w:rPr>
               <w:t xml:space="preserve">This rule has already caught one error: the claim that Self-Refine widens the silent-failure gap survived visual inspection of the counts and did not survive the test.</w:t>
+            </w:r>
+          </w:p>
+        </w:tc>
+      </w:tr>
+    </w:tbl>
+    <w:p>
+      <w:r>
+        <w:br w:type="page"/>
+      </w:r>
+    </w:p>
+    <w:p>
+      <w:pPr>
+        <w:pStyle w:val="Heading1"/>
+        <w:spacing w:after="140" w:before="360"/>
+      </w:pPr>
+      <w:r>
+        <w:rPr>
+          <w:b/>
+          <w:bCs/>
+          <w:color w:val="1F3864"/>
+          <w:sz w:val="30"/>
+          <w:szCs w:val="30"/>
+        </w:rPr>
+        <w:t xml:space="preserve">10. Multi-dataset study: the capability × language-type interaction</w:t>
+      </w:r>
+    </w:p>
+    <w:p>
+      <w:pPr>
+        <w:spacing w:after="160" w:line="276"/>
+      </w:pPr>
+      <w:r>
+        <w:rPr>
+          <w:sz w:val="21"/>
+          <w:szCs w:val="21"/>
+        </w:rPr>
+        <w:t xml:space="preserve">The single-dataset analysis was extended to two further benchmarks, ProofWriter and PrOntoQA, using the renma evaluation subsets that Logic-LM and LINC report on — so these prevalence numbers are directly comparable to that prior work. This was the experiment that tested whether the phenomenon generalises. It does, but not uniformly, and the non-uniformity is the finding.</w:t>
+      </w:r>
+    </w:p>
+    <w:p>
+      <w:pPr>
+        <w:pStyle w:val="Heading2"/>
+        <w:spacing w:after="140" w:before="260"/>
+      </w:pPr>
+      <w:r>
+        <w:rPr>
+          <w:b/>
+          <w:bCs/>
+          <w:color w:val="1F3864"/>
+          <w:sz w:val="25"/>
+          <w:szCs w:val="25"/>
+        </w:rPr>
+        <w:t xml:space="preserve">10.1 Vanilla prevalence across 3 datasets × 3 models</w:t>
+      </w:r>
+    </w:p>
+    <w:p>
+      <w:pPr>
+        <w:spacing w:after="120" w:line="276"/>
+      </w:pPr>
+      <w:r>
+        <w:rPr>
+          <w:sz w:val="21"/>
+          <w:szCs w:val="21"/>
+        </w:rPr>
+        <w:t xml:space="preserve">Full validation splits, story-clustered 95% CIs. wrong_dir = confidently wrong; under_det = gold True/False but predicted Uncertain (translation lost content).</w:t>
+      </w:r>
+    </w:p>
+    <w:tbl>
+      <w:tblPr>
+        <w:tblW w:type="dxa" w:w="9026"/>
+        <w:tblBorders>
+          <w:top w:val="single" w:color="auto" w:sz="4"/>
+          <w:left w:val="single" w:color="auto" w:sz="4"/>
+          <w:bottom w:val="single" w:color="auto" w:sz="4"/>
+          <w:right w:val="single" w:color="auto" w:sz="4"/>
+          <w:insideH w:val="single" w:color="auto" w:sz="4"/>
+          <w:insideV w:val="single" w:color="auto" w:sz="4"/>
+        </w:tblBorders>
+      </w:tblPr>
+      <w:tblGrid>
+        <w:gridCol w:w="1900"/>
+        <w:gridCol w:w="1750"/>
+        <w:gridCol w:w="700"/>
+        <w:gridCol w:w="1176"/>
+        <w:gridCol w:w="1200"/>
+        <w:gridCol w:w="1150"/>
+        <w:gridCol w:w="1150"/>
+      </w:tblGrid>
+      <w:tr>
+        <w:trPr>
+          <w:tblHeader/>
+        </w:trPr>
+        <w:tc>
+          <w:tcPr>
+            <w:tcW w:type="dxa" w:w="1900"/>
+            <w:shd w:fill="1F3864" w:val="clear"/>
+            <w:tcMar>
+              <w:top w:type="dxa" w:w="90"/>
+              <w:left w:type="dxa" w:w="120"/>
+              <w:bottom w:type="dxa" w:w="90"/>
+              <w:right w:type="dxa" w:w="120"/>
+            </w:tcMar>
+          </w:tcPr>
+          <w:p>
+            <w:pPr>
+              <w:spacing w:after="0"/>
+            </w:pPr>
+            <w:r>
+              <w:rPr>
+                <w:b/>
+                <w:bCs/>
+                <w:color w:val="FFFFFF"/>
+                <w:sz w:val="18"/>
+                <w:szCs w:val="18"/>
+              </w:rPr>
+              <w:t xml:space="preserve">dataset</w:t>
+            </w:r>
+          </w:p>
+        </w:tc>
+        <w:tc>
+          <w:tcPr>
+            <w:tcW w:type="dxa" w:w="1750"/>
+            <w:shd w:fill="1F3864" w:val="clear"/>
+            <w:tcMar>
+              <w:top w:type="dxa" w:w="90"/>
+              <w:left w:type="dxa" w:w="120"/>
+              <w:bottom w:type="dxa" w:w="90"/>
+              <w:right w:type="dxa" w:w="120"/>
+            </w:tcMar>
+          </w:tcPr>
+          <w:p>
+            <w:pPr>
+              <w:spacing w:after="0"/>
+              <w:jc w:val="center"/>
+            </w:pPr>
+            <w:r>
+              <w:rPr>
+                <w:b/>
+                <w:bCs/>
+                <w:color w:val="FFFFFF"/>
+                <w:sz w:val="18"/>
+                <w:szCs w:val="18"/>
+              </w:rPr>
+              <w:t xml:space="preserve">model</w:t>
+            </w:r>
+          </w:p>
+        </w:tc>
+        <w:tc>
+          <w:tcPr>
+            <w:tcW w:type="dxa" w:w="700"/>
+            <w:shd w:fill="1F3864" w:val="clear"/>
+            <w:tcMar>
+              <w:top w:type="dxa" w:w="90"/>
+              <w:left w:type="dxa" w:w="120"/>
+              <w:bottom w:type="dxa" w:w="90"/>
+              <w:right w:type="dxa" w:w="120"/>
+            </w:tcMar>
+          </w:tcPr>
+          <w:p>
+            <w:pPr>
+              <w:spacing w:after="0"/>
+              <w:jc w:val="center"/>
+            </w:pPr>
+            <w:r>
+              <w:rPr>
+                <w:b/>
+                <w:bCs/>
+                <w:color w:val="FFFFFF"/>
+                <w:sz w:val="18"/>
+                <w:szCs w:val="18"/>
+              </w:rPr>
+              <w:t xml:space="preserve">n</w:t>
+            </w:r>
+          </w:p>
+        </w:tc>
+        <w:tc>
+          <w:tcPr>
+            <w:tcW w:type="dxa" w:w="1176"/>
+            <w:shd w:fill="1F3864" w:val="clear"/>
+            <w:tcMar>
+              <w:top w:type="dxa" w:w="90"/>
+              <w:left w:type="dxa" w:w="120"/>
+              <w:bottom w:type="dxa" w:w="90"/>
+              <w:right w:type="dxa" w:w="120"/>
+            </w:tcMar>
+          </w:tcPr>
+          <w:p>
+            <w:pPr>
+              <w:spacing w:after="0"/>
+              <w:jc w:val="center"/>
+            </w:pPr>
+            <w:r>
+              <w:rPr>
+                <w:b/>
+                <w:bCs/>
+                <w:color w:val="FFFFFF"/>
+                <w:sz w:val="18"/>
+                <w:szCs w:val="18"/>
+              </w:rPr>
+              <w:t xml:space="preserve">accuracy</w:t>
+            </w:r>
+          </w:p>
+        </w:tc>
+        <w:tc>
+          <w:tcPr>
+            <w:tcW w:type="dxa" w:w="1200"/>
+            <w:shd w:fill="1F3864" w:val="clear"/>
+            <w:tcMar>
+              <w:top w:type="dxa" w:w="90"/>
+              <w:left w:type="dxa" w:w="120"/>
+              <w:bottom w:type="dxa" w:w="90"/>
+              <w:right w:type="dxa" w:w="120"/>
+            </w:tcMar>
+          </w:tcPr>
+          <w:p>
+            <w:pPr>
+              <w:spacing w:after="0"/>
+              <w:jc w:val="center"/>
+            </w:pPr>
+            <w:r>
+              <w:rPr>
+                <w:b/>
+                <w:bCs/>
+                <w:color w:val="FFFFFF"/>
+                <w:sz w:val="18"/>
+                <w:szCs w:val="18"/>
+              </w:rPr>
+              <w:t xml:space="preserve">silent</w:t>
+            </w:r>
+          </w:p>
+        </w:tc>
+        <w:tc>
+          <w:tcPr>
+            <w:tcW w:type="dxa" w:w="1150"/>
+            <w:shd w:fill="1F3864" w:val="clear"/>
+            <w:tcMar>
+              <w:top w:type="dxa" w:w="90"/>
+              <w:left w:type="dxa" w:w="120"/>
+              <w:bottom w:type="dxa" w:w="90"/>
+              <w:right w:type="dxa" w:w="120"/>
+            </w:tcMar>
+          </w:tcPr>
+          <w:p>
+            <w:pPr>
+              <w:spacing w:after="0"/>
+              <w:jc w:val="center"/>
+            </w:pPr>
+            <w:r>
+              <w:rPr>
+                <w:b/>
+                <w:bCs/>
+                <w:color w:val="FFFFFF"/>
+                <w:sz w:val="18"/>
+                <w:szCs w:val="18"/>
+              </w:rPr>
+              <w:t xml:space="preserve">wrong_dir</w:t>
+            </w:r>
+          </w:p>
+        </w:tc>
+        <w:tc>
+          <w:tcPr>
+            <w:tcW w:type="dxa" w:w="1150"/>
+            <w:shd w:fill="1F3864" w:val="clear"/>
+            <w:tcMar>
+              <w:top w:type="dxa" w:w="90"/>
+              <w:left w:type="dxa" w:w="120"/>
+              <w:bottom w:type="dxa" w:w="90"/>
+              <w:right w:type="dxa" w:w="120"/>
+            </w:tcMar>
+          </w:tcPr>
+          <w:p>
+            <w:pPr>
+              <w:spacing w:after="0"/>
+              <w:jc w:val="center"/>
+            </w:pPr>
+            <w:r>
+              <w:rPr>
+                <w:b/>
+                <w:bCs/>
+                <w:color w:val="FFFFFF"/>
+                <w:sz w:val="18"/>
+                <w:szCs w:val="18"/>
+              </w:rPr>
+              <w:t xml:space="preserve">under_det</w:t>
+            </w:r>
+          </w:p>
+        </w:tc>
+      </w:tr>
+      <w:tr>
+        <w:tc>
+          <w:tcPr>
+            <w:tcW w:type="dxa" w:w="1900"/>
+            <w:shd w:fill="FFFFFF" w:val="clear"/>
+            <w:tcMar>
+              <w:top w:type="dxa" w:w="80"/>
+              <w:left w:type="dxa" w:w="120"/>
+              <w:bottom w:type="dxa" w:w="80"/>
+              <w:right w:type="dxa" w:w="120"/>
+            </w:tcMar>
+          </w:tcPr>
+          <w:p>
+            <w:pPr>
+              <w:spacing w:after="0" w:line="252"/>
+            </w:pPr>
+            <w:r>
+              <w:rPr>
+                <w:sz w:val="18"/>
+                <w:szCs w:val="18"/>
+              </w:rPr>
+              <w:t xml:space="preserve">folio</w:t>
+            </w:r>
+          </w:p>
+        </w:tc>
+        <w:tc>
+          <w:tcPr>
+            <w:tcW w:type="dxa" w:w="1750"/>
+            <w:shd w:fill="FFFFFF" w:val="clear"/>
+            <w:tcMar>
+              <w:top w:type="dxa" w:w="80"/>
+              <w:left w:type="dxa" w:w="120"/>
+              <w:bottom w:type="dxa" w:w="80"/>
+              <w:right w:type="dxa" w:w="120"/>
+            </w:tcMar>
+          </w:tcPr>
+          <w:p>
+            <w:pPr>
+              <w:spacing w:after="0" w:line="252"/>
+              <w:jc w:val="center"/>
+            </w:pPr>
+            <w:r>
+              <w:rPr>
+                <w:sz w:val="18"/>
+                <w:szCs w:val="18"/>
+              </w:rPr>
+              <w:t xml:space="preserve">Llama-3.1-8B</w:t>
+            </w:r>
+          </w:p>
+        </w:tc>
+        <w:tc>
+          <w:tcPr>
+            <w:tcW w:type="dxa" w:w="700"/>
+            <w:shd w:fill="FFFFFF" w:val="clear"/>
+            <w:tcMar>
+              <w:top w:type="dxa" w:w="80"/>
+              <w:left w:type="dxa" w:w="120"/>
+              <w:bottom w:type="dxa" w:w="80"/>
+              <w:right w:type="dxa" w:w="120"/>
+            </w:tcMar>
+          </w:tcPr>
+          <w:p>
+            <w:pPr>
+              <w:spacing w:after="0" w:line="252"/>
+              <w:jc w:val="center"/>
+            </w:pPr>
+            <w:r>
+              <w:rPr>
+                <w:sz w:val="18"/>
+                <w:szCs w:val="18"/>
+              </w:rPr>
+              <w:t xml:space="preserve">171</w:t>
+            </w:r>
+          </w:p>
+        </w:tc>
+        <w:tc>
+          <w:tcPr>
+            <w:tcW w:type="dxa" w:w="1176"/>
+            <w:shd w:fill="FFFFFF" w:val="clear"/>
+            <w:tcMar>
+              <w:top w:type="dxa" w:w="80"/>
+              <w:left w:type="dxa" w:w="120"/>
+              <w:bottom w:type="dxa" w:w="80"/>
+              <w:right w:type="dxa" w:w="120"/>
+            </w:tcMar>
+          </w:tcPr>
+          <w:p>
+            <w:pPr>
+              <w:spacing w:after="0" w:line="252"/>
+              <w:jc w:val="center"/>
+            </w:pPr>
+            <w:r>
+              <w:rPr>
+                <w:sz w:val="18"/>
+                <w:szCs w:val="18"/>
+              </w:rPr>
+              <w:t xml:space="preserve">60%</w:t>
+            </w:r>
+          </w:p>
+        </w:tc>
+        <w:tc>
+          <w:tcPr>
+            <w:tcW w:type="dxa" w:w="1200"/>
+            <w:shd w:fill="FFFFFF" w:val="clear"/>
+            <w:tcMar>
+              <w:top w:type="dxa" w:w="80"/>
+              <w:left w:type="dxa" w:w="120"/>
+              <w:bottom w:type="dxa" w:w="80"/>
+              <w:right w:type="dxa" w:w="120"/>
+            </w:tcMar>
+          </w:tcPr>
+          <w:p>
+            <w:pPr>
+              <w:spacing w:after="0" w:line="252"/>
+              <w:jc w:val="center"/>
+            </w:pPr>
+            <w:r>
+              <w:rPr>
+                <w:b/>
+                <w:bCs/>
+                <w:color w:val="9C1F1F"/>
+                <w:sz w:val="18"/>
+                <w:szCs w:val="18"/>
+              </w:rPr>
+              <w:t xml:space="preserve">40%</w:t>
+            </w:r>
+          </w:p>
+        </w:tc>
+        <w:tc>
+          <w:tcPr>
+            <w:tcW w:type="dxa" w:w="1150"/>
+            <w:shd w:fill="FFFFFF" w:val="clear"/>
+            <w:tcMar>
+              <w:top w:type="dxa" w:w="80"/>
+              <w:left w:type="dxa" w:w="120"/>
+              <w:bottom w:type="dxa" w:w="80"/>
+              <w:right w:type="dxa" w:w="120"/>
+            </w:tcMar>
+          </w:tcPr>
+          <w:p>
+            <w:pPr>
+              <w:spacing w:after="0" w:line="252"/>
+              <w:jc w:val="center"/>
+            </w:pPr>
+            <w:r>
+              <w:rPr>
+                <w:sz w:val="18"/>
+                <w:szCs w:val="18"/>
+              </w:rPr>
+              <w:t xml:space="preserve">7%</w:t>
+            </w:r>
+          </w:p>
+        </w:tc>
+        <w:tc>
+          <w:tcPr>
+            <w:tcW w:type="dxa" w:w="1150"/>
+            <w:shd w:fill="FFFFFF" w:val="clear"/>
+            <w:tcMar>
+              <w:top w:type="dxa" w:w="80"/>
+              <w:left w:type="dxa" w:w="120"/>
+              <w:bottom w:type="dxa" w:w="80"/>
+              <w:right w:type="dxa" w:w="120"/>
+            </w:tcMar>
+          </w:tcPr>
+          <w:p>
+            <w:pPr>
+              <w:spacing w:after="0" w:line="252"/>
+              <w:jc w:val="center"/>
+            </w:pPr>
+            <w:r>
+              <w:rPr>
+                <w:sz w:val="18"/>
+                <w:szCs w:val="18"/>
+              </w:rPr>
+              <w:t xml:space="preserve">33%</w:t>
+            </w:r>
+          </w:p>
+        </w:tc>
+      </w:tr>
+      <w:tr>
+        <w:tc>
+          <w:tcPr>
+            <w:tcW w:type="dxa" w:w="1900"/>
+            <w:shd w:fill="F7F8FA" w:val="clear"/>
+            <w:tcMar>
+              <w:top w:type="dxa" w:w="80"/>
+              <w:left w:type="dxa" w:w="120"/>
+              <w:bottom w:type="dxa" w:w="80"/>
+              <w:right w:type="dxa" w:w="120"/>
+            </w:tcMar>
+          </w:tcPr>
+          <w:p>
+            <w:pPr>
+              <w:spacing w:after="0" w:line="252"/>
+            </w:pPr>
+            <w:r>
+              <w:rPr>
+                <w:sz w:val="18"/>
+                <w:szCs w:val="18"/>
+              </w:rPr>
+              <w:t xml:space="preserve">folio</w:t>
+            </w:r>
+          </w:p>
+        </w:tc>
+        <w:tc>
+          <w:tcPr>
+            <w:tcW w:type="dxa" w:w="1750"/>
+            <w:shd w:fill="F7F8FA" w:val="clear"/>
+            <w:tcMar>
+              <w:top w:type="dxa" w:w="80"/>
+              <w:left w:type="dxa" w:w="120"/>
+              <w:bottom w:type="dxa" w:w="80"/>
+              <w:right w:type="dxa" w:w="120"/>
+            </w:tcMar>
+          </w:tcPr>
+          <w:p>
+            <w:pPr>
+              <w:spacing w:after="0" w:line="252"/>
+              <w:jc w:val="center"/>
+            </w:pPr>
+            <w:r>
+              <w:rPr>
+                <w:sz w:val="18"/>
+                <w:szCs w:val="18"/>
+              </w:rPr>
+              <w:t xml:space="preserve">gpt-4o-mini</w:t>
+            </w:r>
+          </w:p>
+        </w:tc>
+        <w:tc>
+          <w:tcPr>
+            <w:tcW w:type="dxa" w:w="700"/>
+            <w:shd w:fill="F7F8FA" w:val="clear"/>
+            <w:tcMar>
+              <w:top w:type="dxa" w:w="80"/>
+              <w:left w:type="dxa" w:w="120"/>
+              <w:bottom w:type="dxa" w:w="80"/>
+              <w:right w:type="dxa" w:w="120"/>
+            </w:tcMar>
+          </w:tcPr>
+          <w:p>
+            <w:pPr>
+              <w:spacing w:after="0" w:line="252"/>
+              <w:jc w:val="center"/>
+            </w:pPr>
+            <w:r>
+              <w:rPr>
+                <w:sz w:val="18"/>
+                <w:szCs w:val="18"/>
+              </w:rPr>
+              <w:t xml:space="preserve">184</w:t>
+            </w:r>
+          </w:p>
+        </w:tc>
+        <w:tc>
+          <w:tcPr>
+            <w:tcW w:type="dxa" w:w="1176"/>
+            <w:shd w:fill="F7F8FA" w:val="clear"/>
+            <w:tcMar>
+              <w:top w:type="dxa" w:w="80"/>
+              <w:left w:type="dxa" w:w="120"/>
+              <w:bottom w:type="dxa" w:w="80"/>
+              <w:right w:type="dxa" w:w="120"/>
+            </w:tcMar>
+          </w:tcPr>
+          <w:p>
+            <w:pPr>
+              <w:spacing w:after="0" w:line="252"/>
+              <w:jc w:val="center"/>
+            </w:pPr>
+            <w:r>
+              <w:rPr>
+                <w:sz w:val="18"/>
+                <w:szCs w:val="18"/>
+              </w:rPr>
+              <w:t xml:space="preserve">61%</w:t>
+            </w:r>
+          </w:p>
+        </w:tc>
+        <w:tc>
+          <w:tcPr>
+            <w:tcW w:type="dxa" w:w="1200"/>
+            <w:shd w:fill="F7F8FA" w:val="clear"/>
+            <w:tcMar>
+              <w:top w:type="dxa" w:w="80"/>
+              <w:left w:type="dxa" w:w="120"/>
+              <w:bottom w:type="dxa" w:w="80"/>
+              <w:right w:type="dxa" w:w="120"/>
+            </w:tcMar>
+          </w:tcPr>
+          <w:p>
+            <w:pPr>
+              <w:spacing w:after="0" w:line="252"/>
+              <w:jc w:val="center"/>
+            </w:pPr>
+            <w:r>
+              <w:rPr>
+                <w:b/>
+                <w:bCs/>
+                <w:color w:val="9C1F1F"/>
+                <w:sz w:val="18"/>
+                <w:szCs w:val="18"/>
+              </w:rPr>
+              <w:t xml:space="preserve">39%</w:t>
+            </w:r>
+          </w:p>
+        </w:tc>
+        <w:tc>
+          <w:tcPr>
+            <w:tcW w:type="dxa" w:w="1150"/>
+            <w:shd w:fill="F7F8FA" w:val="clear"/>
+            <w:tcMar>
+              <w:top w:type="dxa" w:w="80"/>
+              <w:left w:type="dxa" w:w="120"/>
+              <w:bottom w:type="dxa" w:w="80"/>
+              <w:right w:type="dxa" w:w="120"/>
+            </w:tcMar>
+          </w:tcPr>
+          <w:p>
+            <w:pPr>
+              <w:spacing w:after="0" w:line="252"/>
+              <w:jc w:val="center"/>
+            </w:pPr>
+            <w:r>
+              <w:rPr>
+                <w:sz w:val="18"/>
+                <w:szCs w:val="18"/>
+              </w:rPr>
+              <w:t xml:space="preserve">9%</w:t>
+            </w:r>
+          </w:p>
+        </w:tc>
+        <w:tc>
+          <w:tcPr>
+            <w:tcW w:type="dxa" w:w="1150"/>
+            <w:shd w:fill="F7F8FA" w:val="clear"/>
+            <w:tcMar>
+              <w:top w:type="dxa" w:w="80"/>
+              <w:left w:type="dxa" w:w="120"/>
+              <w:bottom w:type="dxa" w:w="80"/>
+              <w:right w:type="dxa" w:w="120"/>
+            </w:tcMar>
+          </w:tcPr>
+          <w:p>
+            <w:pPr>
+              <w:spacing w:after="0" w:line="252"/>
+              <w:jc w:val="center"/>
+            </w:pPr>
+            <w:r>
+              <w:rPr>
+                <w:sz w:val="18"/>
+                <w:szCs w:val="18"/>
+              </w:rPr>
+              <w:t xml:space="preserve">30%</w:t>
+            </w:r>
+          </w:p>
+        </w:tc>
+      </w:tr>
+      <w:tr>
+        <w:tc>
+          <w:tcPr>
+            <w:tcW w:type="dxa" w:w="1900"/>
+            <w:shd w:fill="FFFFFF" w:val="clear"/>
+            <w:tcMar>
+              <w:top w:type="dxa" w:w="80"/>
+              <w:left w:type="dxa" w:w="120"/>
+              <w:bottom w:type="dxa" w:w="80"/>
+              <w:right w:type="dxa" w:w="120"/>
+            </w:tcMar>
+          </w:tcPr>
+          <w:p>
+            <w:pPr>
+              <w:spacing w:after="0" w:line="252"/>
+            </w:pPr>
+            <w:r>
+              <w:rPr>
+                <w:sz w:val="18"/>
+                <w:szCs w:val="18"/>
+              </w:rPr>
+              <w:t xml:space="preserve">folio</w:t>
+            </w:r>
+          </w:p>
+        </w:tc>
+        <w:tc>
+          <w:tcPr>
+            <w:tcW w:type="dxa" w:w="1750"/>
+            <w:shd w:fill="FFFFFF" w:val="clear"/>
+            <w:tcMar>
+              <w:top w:type="dxa" w:w="80"/>
+              <w:left w:type="dxa" w:w="120"/>
+              <w:bottom w:type="dxa" w:w="80"/>
+              <w:right w:type="dxa" w:w="120"/>
+            </w:tcMar>
+          </w:tcPr>
+          <w:p>
+            <w:pPr>
+              <w:spacing w:after="0" w:line="252"/>
+              <w:jc w:val="center"/>
+            </w:pPr>
+            <w:r>
+              <w:rPr>
+                <w:sz w:val="18"/>
+                <w:szCs w:val="18"/>
+              </w:rPr>
+              <w:t xml:space="preserve">gpt-4o</w:t>
+            </w:r>
+          </w:p>
+        </w:tc>
+        <w:tc>
+          <w:tcPr>
+            <w:tcW w:type="dxa" w:w="700"/>
+            <w:shd w:fill="FFFFFF" w:val="clear"/>
+            <w:tcMar>
+              <w:top w:type="dxa" w:w="80"/>
+              <w:left w:type="dxa" w:w="120"/>
+              <w:bottom w:type="dxa" w:w="80"/>
+              <w:right w:type="dxa" w:w="120"/>
+            </w:tcMar>
+          </w:tcPr>
+          <w:p>
+            <w:pPr>
+              <w:spacing w:after="0" w:line="252"/>
+              <w:jc w:val="center"/>
+            </w:pPr>
+            <w:r>
+              <w:rPr>
+                <w:sz w:val="18"/>
+                <w:szCs w:val="18"/>
+              </w:rPr>
+              <w:t xml:space="preserve">188</w:t>
+            </w:r>
+          </w:p>
+        </w:tc>
+        <w:tc>
+          <w:tcPr>
+            <w:tcW w:type="dxa" w:w="1176"/>
+            <w:shd w:fill="FFFFFF" w:val="clear"/>
+            <w:tcMar>
+              <w:top w:type="dxa" w:w="80"/>
+              <w:left w:type="dxa" w:w="120"/>
+              <w:bottom w:type="dxa" w:w="80"/>
+              <w:right w:type="dxa" w:w="120"/>
+            </w:tcMar>
+          </w:tcPr>
+          <w:p>
+            <w:pPr>
+              <w:spacing w:after="0" w:line="252"/>
+              <w:jc w:val="center"/>
+            </w:pPr>
+            <w:r>
+              <w:rPr>
+                <w:sz w:val="18"/>
+                <w:szCs w:val="18"/>
+              </w:rPr>
+              <w:t xml:space="preserve">71%</w:t>
+            </w:r>
+          </w:p>
+        </w:tc>
+        <w:tc>
+          <w:tcPr>
+            <w:tcW w:type="dxa" w:w="1200"/>
+            <w:shd w:fill="FFFFFF" w:val="clear"/>
+            <w:tcMar>
+              <w:top w:type="dxa" w:w="80"/>
+              <w:left w:type="dxa" w:w="120"/>
+              <w:bottom w:type="dxa" w:w="80"/>
+              <w:right w:type="dxa" w:w="120"/>
+            </w:tcMar>
+          </w:tcPr>
+          <w:p>
+            <w:pPr>
+              <w:spacing w:after="0" w:line="252"/>
+              <w:jc w:val="center"/>
+            </w:pPr>
+            <w:r>
+              <w:rPr>
+                <w:b/>
+                <w:bCs/>
+                <w:color w:val="9C1F1F"/>
+                <w:sz w:val="18"/>
+                <w:szCs w:val="18"/>
+              </w:rPr>
+              <w:t xml:space="preserve">29%</w:t>
+            </w:r>
+          </w:p>
+        </w:tc>
+        <w:tc>
+          <w:tcPr>
+            <w:tcW w:type="dxa" w:w="1150"/>
+            <w:shd w:fill="FFFFFF" w:val="clear"/>
+            <w:tcMar>
+              <w:top w:type="dxa" w:w="80"/>
+              <w:left w:type="dxa" w:w="120"/>
+              <w:bottom w:type="dxa" w:w="80"/>
+              <w:right w:type="dxa" w:w="120"/>
+            </w:tcMar>
+          </w:tcPr>
+          <w:p>
+            <w:pPr>
+              <w:spacing w:after="0" w:line="252"/>
+              <w:jc w:val="center"/>
+            </w:pPr>
+            <w:r>
+              <w:rPr>
+                <w:sz w:val="18"/>
+                <w:szCs w:val="18"/>
+              </w:rPr>
+              <w:t xml:space="preserve">3%</w:t>
+            </w:r>
+          </w:p>
+        </w:tc>
+        <w:tc>
+          <w:tcPr>
+            <w:tcW w:type="dxa" w:w="1150"/>
+            <w:shd w:fill="FFFFFF" w:val="clear"/>
+            <w:tcMar>
+              <w:top w:type="dxa" w:w="80"/>
+              <w:left w:type="dxa" w:w="120"/>
+              <w:bottom w:type="dxa" w:w="80"/>
+              <w:right w:type="dxa" w:w="120"/>
+            </w:tcMar>
+          </w:tcPr>
+          <w:p>
+            <w:pPr>
+              <w:spacing w:after="0" w:line="252"/>
+              <w:jc w:val="center"/>
+            </w:pPr>
+            <w:r>
+              <w:rPr>
+                <w:sz w:val="18"/>
+                <w:szCs w:val="18"/>
+              </w:rPr>
+              <w:t xml:space="preserve">26%</w:t>
+            </w:r>
+          </w:p>
+        </w:tc>
+      </w:tr>
+      <w:tr>
+        <w:tc>
+          <w:tcPr>
+            <w:tcW w:type="dxa" w:w="1900"/>
+            <w:shd w:fill="F7F8FA" w:val="clear"/>
+            <w:tcMar>
+              <w:top w:type="dxa" w:w="80"/>
+              <w:left w:type="dxa" w:w="120"/>
+              <w:bottom w:type="dxa" w:w="80"/>
+              <w:right w:type="dxa" w:w="120"/>
+            </w:tcMar>
+          </w:tcPr>
+          <w:p>
+            <w:pPr>
+              <w:spacing w:after="0" w:line="252"/>
+            </w:pPr>
+            <w:r>
+              <w:rPr>
+                <w:sz w:val="18"/>
+                <w:szCs w:val="18"/>
+              </w:rPr>
+              <w:t xml:space="preserve">proofwriter</w:t>
+            </w:r>
+          </w:p>
+        </w:tc>
+        <w:tc>
+          <w:tcPr>
+            <w:tcW w:type="dxa" w:w="1750"/>
+            <w:shd w:fill="F7F8FA" w:val="clear"/>
+            <w:tcMar>
+              <w:top w:type="dxa" w:w="80"/>
+              <w:left w:type="dxa" w:w="120"/>
+              <w:bottom w:type="dxa" w:w="80"/>
+              <w:right w:type="dxa" w:w="120"/>
+            </w:tcMar>
+          </w:tcPr>
+          <w:p>
+            <w:pPr>
+              <w:spacing w:after="0" w:line="252"/>
+              <w:jc w:val="center"/>
+            </w:pPr>
+            <w:r>
+              <w:rPr>
+                <w:sz w:val="18"/>
+                <w:szCs w:val="18"/>
+              </w:rPr>
+              <w:t xml:space="preserve">Llama-3.1-8B</w:t>
+            </w:r>
+          </w:p>
+        </w:tc>
+        <w:tc>
+          <w:tcPr>
+            <w:tcW w:type="dxa" w:w="700"/>
+            <w:shd w:fill="F7F8FA" w:val="clear"/>
+            <w:tcMar>
+              <w:top w:type="dxa" w:w="80"/>
+              <w:left w:type="dxa" w:w="120"/>
+              <w:bottom w:type="dxa" w:w="80"/>
+              <w:right w:type="dxa" w:w="120"/>
+            </w:tcMar>
+          </w:tcPr>
+          <w:p>
+            <w:pPr>
+              <w:spacing w:after="0" w:line="252"/>
+              <w:jc w:val="center"/>
+            </w:pPr>
+            <w:r>
+              <w:rPr>
+                <w:sz w:val="18"/>
+                <w:szCs w:val="18"/>
+              </w:rPr>
+              <w:t xml:space="preserve">585</w:t>
+            </w:r>
+          </w:p>
+        </w:tc>
+        <w:tc>
+          <w:tcPr>
+            <w:tcW w:type="dxa" w:w="1176"/>
+            <w:shd w:fill="F7F8FA" w:val="clear"/>
+            <w:tcMar>
+              <w:top w:type="dxa" w:w="80"/>
+              <w:left w:type="dxa" w:w="120"/>
+              <w:bottom w:type="dxa" w:w="80"/>
+              <w:right w:type="dxa" w:w="120"/>
+            </w:tcMar>
+          </w:tcPr>
+          <w:p>
+            <w:pPr>
+              <w:spacing w:after="0" w:line="252"/>
+              <w:jc w:val="center"/>
+            </w:pPr>
+            <w:r>
+              <w:rPr>
+                <w:sz w:val="18"/>
+                <w:szCs w:val="18"/>
+              </w:rPr>
+              <w:t xml:space="preserve">85%</w:t>
+            </w:r>
+          </w:p>
+        </w:tc>
+        <w:tc>
+          <w:tcPr>
+            <w:tcW w:type="dxa" w:w="1200"/>
+            <w:shd w:fill="F7F8FA" w:val="clear"/>
+            <w:tcMar>
+              <w:top w:type="dxa" w:w="80"/>
+              <w:left w:type="dxa" w:w="120"/>
+              <w:bottom w:type="dxa" w:w="80"/>
+              <w:right w:type="dxa" w:w="120"/>
+            </w:tcMar>
+          </w:tcPr>
+          <w:p>
+            <w:pPr>
+              <w:spacing w:after="0" w:line="252"/>
+              <w:jc w:val="center"/>
+            </w:pPr>
+            <w:r>
+              <w:rPr>
+                <w:sz w:val="18"/>
+                <w:szCs w:val="18"/>
+              </w:rPr>
+              <w:t xml:space="preserve">15%</w:t>
+            </w:r>
+          </w:p>
+        </w:tc>
+        <w:tc>
+          <w:tcPr>
+            <w:tcW w:type="dxa" w:w="1150"/>
+            <w:shd w:fill="F7F8FA" w:val="clear"/>
+            <w:tcMar>
+              <w:top w:type="dxa" w:w="80"/>
+              <w:left w:type="dxa" w:w="120"/>
+              <w:bottom w:type="dxa" w:w="80"/>
+              <w:right w:type="dxa" w:w="120"/>
+            </w:tcMar>
+          </w:tcPr>
+          <w:p>
+            <w:pPr>
+              <w:spacing w:after="0" w:line="252"/>
+              <w:jc w:val="center"/>
+            </w:pPr>
+            <w:r>
+              <w:rPr>
+                <w:sz w:val="18"/>
+                <w:szCs w:val="18"/>
+              </w:rPr>
+              <w:t xml:space="preserve">6%</w:t>
+            </w:r>
+          </w:p>
+        </w:tc>
+        <w:tc>
+          <w:tcPr>
+            <w:tcW w:type="dxa" w:w="1150"/>
+            <w:shd w:fill="F7F8FA" w:val="clear"/>
+            <w:tcMar>
+              <w:top w:type="dxa" w:w="80"/>
+              <w:left w:type="dxa" w:w="120"/>
+              <w:bottom w:type="dxa" w:w="80"/>
+              <w:right w:type="dxa" w:w="120"/>
+            </w:tcMar>
+          </w:tcPr>
+          <w:p>
+            <w:pPr>
+              <w:spacing w:after="0" w:line="252"/>
+              <w:jc w:val="center"/>
+            </w:pPr>
+            <w:r>
+              <w:rPr>
+                <w:sz w:val="18"/>
+                <w:szCs w:val="18"/>
+              </w:rPr>
+              <w:t xml:space="preserve">8%</w:t>
+            </w:r>
+          </w:p>
+        </w:tc>
+      </w:tr>
+      <w:tr>
+        <w:tc>
+          <w:tcPr>
+            <w:tcW w:type="dxa" w:w="1900"/>
+            <w:shd w:fill="FFFFFF" w:val="clear"/>
+            <w:tcMar>
+              <w:top w:type="dxa" w:w="80"/>
+              <w:left w:type="dxa" w:w="120"/>
+              <w:bottom w:type="dxa" w:w="80"/>
+              <w:right w:type="dxa" w:w="120"/>
+            </w:tcMar>
+          </w:tcPr>
+          <w:p>
+            <w:pPr>
+              <w:spacing w:after="0" w:line="252"/>
+            </w:pPr>
+            <w:r>
+              <w:rPr>
+                <w:sz w:val="18"/>
+                <w:szCs w:val="18"/>
+              </w:rPr>
+              <w:t xml:space="preserve">proofwriter</w:t>
+            </w:r>
+          </w:p>
+        </w:tc>
+        <w:tc>
+          <w:tcPr>
+            <w:tcW w:type="dxa" w:w="1750"/>
+            <w:shd w:fill="FFFFFF" w:val="clear"/>
+            <w:tcMar>
+              <w:top w:type="dxa" w:w="80"/>
+              <w:left w:type="dxa" w:w="120"/>
+              <w:bottom w:type="dxa" w:w="80"/>
+              <w:right w:type="dxa" w:w="120"/>
+            </w:tcMar>
+          </w:tcPr>
+          <w:p>
+            <w:pPr>
+              <w:spacing w:after="0" w:line="252"/>
+              <w:jc w:val="center"/>
+            </w:pPr>
+            <w:r>
+              <w:rPr>
+                <w:sz w:val="18"/>
+                <w:szCs w:val="18"/>
+              </w:rPr>
+              <w:t xml:space="preserve">gpt-4o-mini</w:t>
+            </w:r>
+          </w:p>
+        </w:tc>
+        <w:tc>
+          <w:tcPr>
+            <w:tcW w:type="dxa" w:w="700"/>
+            <w:shd w:fill="FFFFFF" w:val="clear"/>
+            <w:tcMar>
+              <w:top w:type="dxa" w:w="80"/>
+              <w:left w:type="dxa" w:w="120"/>
+              <w:bottom w:type="dxa" w:w="80"/>
+              <w:right w:type="dxa" w:w="120"/>
+            </w:tcMar>
+          </w:tcPr>
+          <w:p>
+            <w:pPr>
+              <w:spacing w:after="0" w:line="252"/>
+              <w:jc w:val="center"/>
+            </w:pPr>
+            <w:r>
+              <w:rPr>
+                <w:sz w:val="18"/>
+                <w:szCs w:val="18"/>
+              </w:rPr>
+              <w:t xml:space="preserve">591</w:t>
+            </w:r>
+          </w:p>
+        </w:tc>
+        <w:tc>
+          <w:tcPr>
+            <w:tcW w:type="dxa" w:w="1176"/>
+            <w:shd w:fill="FFFFFF" w:val="clear"/>
+            <w:tcMar>
+              <w:top w:type="dxa" w:w="80"/>
+              <w:left w:type="dxa" w:w="120"/>
+              <w:bottom w:type="dxa" w:w="80"/>
+              <w:right w:type="dxa" w:w="120"/>
+            </w:tcMar>
+          </w:tcPr>
+          <w:p>
+            <w:pPr>
+              <w:spacing w:after="0" w:line="252"/>
+              <w:jc w:val="center"/>
+            </w:pPr>
+            <w:r>
+              <w:rPr>
+                <w:sz w:val="18"/>
+                <w:szCs w:val="18"/>
+              </w:rPr>
+              <w:t xml:space="preserve">96%</w:t>
+            </w:r>
+          </w:p>
+        </w:tc>
+        <w:tc>
+          <w:tcPr>
+            <w:tcW w:type="dxa" w:w="1200"/>
+            <w:shd w:fill="FFFFFF" w:val="clear"/>
+            <w:tcMar>
+              <w:top w:type="dxa" w:w="80"/>
+              <w:left w:type="dxa" w:w="120"/>
+              <w:bottom w:type="dxa" w:w="80"/>
+              <w:right w:type="dxa" w:w="120"/>
+            </w:tcMar>
+          </w:tcPr>
+          <w:p>
+            <w:pPr>
+              <w:spacing w:after="0" w:line="252"/>
+              <w:jc w:val="center"/>
+            </w:pPr>
+            <w:r>
+              <w:rPr>
+                <w:sz w:val="18"/>
+                <w:szCs w:val="18"/>
+              </w:rPr>
+              <w:t xml:space="preserve">4%</w:t>
+            </w:r>
+          </w:p>
+        </w:tc>
+        <w:tc>
+          <w:tcPr>
+            <w:tcW w:type="dxa" w:w="1150"/>
+            <w:shd w:fill="FFFFFF" w:val="clear"/>
+            <w:tcMar>
+              <w:top w:type="dxa" w:w="80"/>
+              <w:left w:type="dxa" w:w="120"/>
+              <w:bottom w:type="dxa" w:w="80"/>
+              <w:right w:type="dxa" w:w="120"/>
+            </w:tcMar>
+          </w:tcPr>
+          <w:p>
+            <w:pPr>
+              <w:spacing w:after="0" w:line="252"/>
+              <w:jc w:val="center"/>
+            </w:pPr>
+            <w:r>
+              <w:rPr>
+                <w:sz w:val="18"/>
+                <w:szCs w:val="18"/>
+              </w:rPr>
+              <w:t xml:space="preserve">3%</w:t>
+            </w:r>
+          </w:p>
+        </w:tc>
+        <w:tc>
+          <w:tcPr>
+            <w:tcW w:type="dxa" w:w="1150"/>
+            <w:shd w:fill="FFFFFF" w:val="clear"/>
+            <w:tcMar>
+              <w:top w:type="dxa" w:w="80"/>
+              <w:left w:type="dxa" w:w="120"/>
+              <w:bottom w:type="dxa" w:w="80"/>
+              <w:right w:type="dxa" w:w="120"/>
+            </w:tcMar>
+          </w:tcPr>
+          <w:p>
+            <w:pPr>
+              <w:spacing w:after="0" w:line="252"/>
+              <w:jc w:val="center"/>
+            </w:pPr>
+            <w:r>
+              <w:rPr>
+                <w:sz w:val="18"/>
+                <w:szCs w:val="18"/>
+              </w:rPr>
+              <w:t xml:space="preserve">1%</w:t>
+            </w:r>
+          </w:p>
+        </w:tc>
+      </w:tr>
+      <w:tr>
+        <w:tc>
+          <w:tcPr>
+            <w:tcW w:type="dxa" w:w="1900"/>
+            <w:shd w:fill="F7F8FA" w:val="clear"/>
+            <w:tcMar>
+              <w:top w:type="dxa" w:w="80"/>
+              <w:left w:type="dxa" w:w="120"/>
+              <w:bottom w:type="dxa" w:w="80"/>
+              <w:right w:type="dxa" w:w="120"/>
+            </w:tcMar>
+          </w:tcPr>
+          <w:p>
+            <w:pPr>
+              <w:spacing w:after="0" w:line="252"/>
+            </w:pPr>
+            <w:r>
+              <w:rPr>
+                <w:sz w:val="18"/>
+                <w:szCs w:val="18"/>
+              </w:rPr>
+              <w:t xml:space="preserve">proofwriter</w:t>
+            </w:r>
+          </w:p>
+        </w:tc>
+        <w:tc>
+          <w:tcPr>
+            <w:tcW w:type="dxa" w:w="1750"/>
+            <w:shd w:fill="F7F8FA" w:val="clear"/>
+            <w:tcMar>
+              <w:top w:type="dxa" w:w="80"/>
+              <w:left w:type="dxa" w:w="120"/>
+              <w:bottom w:type="dxa" w:w="80"/>
+              <w:right w:type="dxa" w:w="120"/>
+            </w:tcMar>
+          </w:tcPr>
+          <w:p>
+            <w:pPr>
+              <w:spacing w:after="0" w:line="252"/>
+              <w:jc w:val="center"/>
+            </w:pPr>
+            <w:r>
+              <w:rPr>
+                <w:sz w:val="18"/>
+                <w:szCs w:val="18"/>
+              </w:rPr>
+              <w:t xml:space="preserve">gpt-4o</w:t>
+            </w:r>
+          </w:p>
+        </w:tc>
+        <w:tc>
+          <w:tcPr>
+            <w:tcW w:type="dxa" w:w="700"/>
+            <w:shd w:fill="F7F8FA" w:val="clear"/>
+            <w:tcMar>
+              <w:top w:type="dxa" w:w="80"/>
+              <w:left w:type="dxa" w:w="120"/>
+              <w:bottom w:type="dxa" w:w="80"/>
+              <w:right w:type="dxa" w:w="120"/>
+            </w:tcMar>
+          </w:tcPr>
+          <w:p>
+            <w:pPr>
+              <w:spacing w:after="0" w:line="252"/>
+              <w:jc w:val="center"/>
+            </w:pPr>
+            <w:r>
+              <w:rPr>
+                <w:sz w:val="18"/>
+                <w:szCs w:val="18"/>
+              </w:rPr>
+              <w:t xml:space="preserve">600</w:t>
+            </w:r>
+          </w:p>
+        </w:tc>
+        <w:tc>
+          <w:tcPr>
+            <w:tcW w:type="dxa" w:w="1176"/>
+            <w:shd w:fill="F7F8FA" w:val="clear"/>
+            <w:tcMar>
+              <w:top w:type="dxa" w:w="80"/>
+              <w:left w:type="dxa" w:w="120"/>
+              <w:bottom w:type="dxa" w:w="80"/>
+              <w:right w:type="dxa" w:w="120"/>
+            </w:tcMar>
+          </w:tcPr>
+          <w:p>
+            <w:pPr>
+              <w:spacing w:after="0" w:line="252"/>
+              <w:jc w:val="center"/>
+            </w:pPr>
+            <w:r>
+              <w:rPr>
+                <w:sz w:val="18"/>
+                <w:szCs w:val="18"/>
+              </w:rPr>
+              <w:t xml:space="preserve">97%</w:t>
+            </w:r>
+          </w:p>
+        </w:tc>
+        <w:tc>
+          <w:tcPr>
+            <w:tcW w:type="dxa" w:w="1200"/>
+            <w:shd w:fill="F7F8FA" w:val="clear"/>
+            <w:tcMar>
+              <w:top w:type="dxa" w:w="80"/>
+              <w:left w:type="dxa" w:w="120"/>
+              <w:bottom w:type="dxa" w:w="80"/>
+              <w:right w:type="dxa" w:w="120"/>
+            </w:tcMar>
+          </w:tcPr>
+          <w:p>
+            <w:pPr>
+              <w:spacing w:after="0" w:line="252"/>
+              <w:jc w:val="center"/>
+            </w:pPr>
+            <w:r>
+              <w:rPr>
+                <w:b/>
+                <w:bCs/>
+                <w:color w:val="1E6B34"/>
+                <w:sz w:val="18"/>
+                <w:szCs w:val="18"/>
+              </w:rPr>
+              <w:t xml:space="preserve">3%</w:t>
+            </w:r>
+          </w:p>
+        </w:tc>
+        <w:tc>
+          <w:tcPr>
+            <w:tcW w:type="dxa" w:w="1150"/>
+            <w:shd w:fill="F7F8FA" w:val="clear"/>
+            <w:tcMar>
+              <w:top w:type="dxa" w:w="80"/>
+              <w:left w:type="dxa" w:w="120"/>
+              <w:bottom w:type="dxa" w:w="80"/>
+              <w:right w:type="dxa" w:w="120"/>
+            </w:tcMar>
+          </w:tcPr>
+          <w:p>
+            <w:pPr>
+              <w:spacing w:after="0" w:line="252"/>
+              <w:jc w:val="center"/>
+            </w:pPr>
+            <w:r>
+              <w:rPr>
+                <w:sz w:val="18"/>
+                <w:szCs w:val="18"/>
+              </w:rPr>
+              <w:t xml:space="preserve">2%</w:t>
+            </w:r>
+          </w:p>
+        </w:tc>
+        <w:tc>
+          <w:tcPr>
+            <w:tcW w:type="dxa" w:w="1150"/>
+            <w:shd w:fill="F7F8FA" w:val="clear"/>
+            <w:tcMar>
+              <w:top w:type="dxa" w:w="80"/>
+              <w:left w:type="dxa" w:w="120"/>
+              <w:bottom w:type="dxa" w:w="80"/>
+              <w:right w:type="dxa" w:w="120"/>
+            </w:tcMar>
+          </w:tcPr>
+          <w:p>
+            <w:pPr>
+              <w:spacing w:after="0" w:line="252"/>
+              <w:jc w:val="center"/>
+            </w:pPr>
+            <w:r>
+              <w:rPr>
+                <w:sz w:val="18"/>
+                <w:szCs w:val="18"/>
+              </w:rPr>
+              <w:t xml:space="preserve">0%</w:t>
+            </w:r>
+          </w:p>
+        </w:tc>
+      </w:tr>
+      <w:tr>
+        <w:tc>
+          <w:tcPr>
+            <w:tcW w:type="dxa" w:w="1900"/>
+            <w:shd w:fill="FFFFFF" w:val="clear"/>
+            <w:tcMar>
+              <w:top w:type="dxa" w:w="80"/>
+              <w:left w:type="dxa" w:w="120"/>
+              <w:bottom w:type="dxa" w:w="80"/>
+              <w:right w:type="dxa" w:w="120"/>
+            </w:tcMar>
+          </w:tcPr>
+          <w:p>
+            <w:pPr>
+              <w:spacing w:after="0" w:line="252"/>
+            </w:pPr>
+            <w:r>
+              <w:rPr>
+                <w:sz w:val="18"/>
+                <w:szCs w:val="18"/>
+              </w:rPr>
+              <w:t xml:space="preserve">prontoqa</w:t>
+            </w:r>
+          </w:p>
+        </w:tc>
+        <w:tc>
+          <w:tcPr>
+            <w:tcW w:type="dxa" w:w="1750"/>
+            <w:shd w:fill="FFFFFF" w:val="clear"/>
+            <w:tcMar>
+              <w:top w:type="dxa" w:w="80"/>
+              <w:left w:type="dxa" w:w="120"/>
+              <w:bottom w:type="dxa" w:w="80"/>
+              <w:right w:type="dxa" w:w="120"/>
+            </w:tcMar>
+          </w:tcPr>
+          <w:p>
+            <w:pPr>
+              <w:spacing w:after="0" w:line="252"/>
+              <w:jc w:val="center"/>
+            </w:pPr>
+            <w:r>
+              <w:rPr>
+                <w:sz w:val="18"/>
+                <w:szCs w:val="18"/>
+              </w:rPr>
+              <w:t xml:space="preserve">Llama-3.1-8B</w:t>
+            </w:r>
+          </w:p>
+        </w:tc>
+        <w:tc>
+          <w:tcPr>
+            <w:tcW w:type="dxa" w:w="700"/>
+            <w:shd w:fill="FFFFFF" w:val="clear"/>
+            <w:tcMar>
+              <w:top w:type="dxa" w:w="80"/>
+              <w:left w:type="dxa" w:w="120"/>
+              <w:bottom w:type="dxa" w:w="80"/>
+              <w:right w:type="dxa" w:w="120"/>
+            </w:tcMar>
+          </w:tcPr>
+          <w:p>
+            <w:pPr>
+              <w:spacing w:after="0" w:line="252"/>
+              <w:jc w:val="center"/>
+            </w:pPr>
+            <w:r>
+              <w:rPr>
+                <w:sz w:val="18"/>
+                <w:szCs w:val="18"/>
+              </w:rPr>
+              <w:t xml:space="preserve">481</w:t>
+            </w:r>
+          </w:p>
+        </w:tc>
+        <w:tc>
+          <w:tcPr>
+            <w:tcW w:type="dxa" w:w="1176"/>
+            <w:shd w:fill="FFFFFF" w:val="clear"/>
+            <w:tcMar>
+              <w:top w:type="dxa" w:w="80"/>
+              <w:left w:type="dxa" w:w="120"/>
+              <w:bottom w:type="dxa" w:w="80"/>
+              <w:right w:type="dxa" w:w="120"/>
+            </w:tcMar>
+          </w:tcPr>
+          <w:p>
+            <w:pPr>
+              <w:spacing w:after="0" w:line="252"/>
+              <w:jc w:val="center"/>
+            </w:pPr>
+            <w:r>
+              <w:rPr>
+                <w:sz w:val="18"/>
+                <w:szCs w:val="18"/>
+              </w:rPr>
+              <w:t xml:space="preserve">64%</w:t>
+            </w:r>
+          </w:p>
+        </w:tc>
+        <w:tc>
+          <w:tcPr>
+            <w:tcW w:type="dxa" w:w="1200"/>
+            <w:shd w:fill="FFFFFF" w:val="clear"/>
+            <w:tcMar>
+              <w:top w:type="dxa" w:w="80"/>
+              <w:left w:type="dxa" w:w="120"/>
+              <w:bottom w:type="dxa" w:w="80"/>
+              <w:right w:type="dxa" w:w="120"/>
+            </w:tcMar>
+          </w:tcPr>
+          <w:p>
+            <w:pPr>
+              <w:spacing w:after="0" w:line="252"/>
+              <w:jc w:val="center"/>
+            </w:pPr>
+            <w:r>
+              <w:rPr>
+                <w:b/>
+                <w:bCs/>
+                <w:color w:val="9C1F1F"/>
+                <w:sz w:val="18"/>
+                <w:szCs w:val="18"/>
+              </w:rPr>
+              <w:t xml:space="preserve">36%</w:t>
+            </w:r>
+          </w:p>
+        </w:tc>
+        <w:tc>
+          <w:tcPr>
+            <w:tcW w:type="dxa" w:w="1150"/>
+            <w:shd w:fill="FFFFFF" w:val="clear"/>
+            <w:tcMar>
+              <w:top w:type="dxa" w:w="80"/>
+              <w:left w:type="dxa" w:w="120"/>
+              <w:bottom w:type="dxa" w:w="80"/>
+              <w:right w:type="dxa" w:w="120"/>
+            </w:tcMar>
+          </w:tcPr>
+          <w:p>
+            <w:pPr>
+              <w:spacing w:after="0" w:line="252"/>
+              <w:jc w:val="center"/>
+            </w:pPr>
+            <w:r>
+              <w:rPr>
+                <w:sz w:val="18"/>
+                <w:szCs w:val="18"/>
+              </w:rPr>
+              <w:t xml:space="preserve">5%</w:t>
+            </w:r>
+          </w:p>
+        </w:tc>
+        <w:tc>
+          <w:tcPr>
+            <w:tcW w:type="dxa" w:w="1150"/>
+            <w:shd w:fill="FFFFFF" w:val="clear"/>
+            <w:tcMar>
+              <w:top w:type="dxa" w:w="80"/>
+              <w:left w:type="dxa" w:w="120"/>
+              <w:bottom w:type="dxa" w:w="80"/>
+              <w:right w:type="dxa" w:w="120"/>
+            </w:tcMar>
+          </w:tcPr>
+          <w:p>
+            <w:pPr>
+              <w:spacing w:after="0" w:line="252"/>
+              <w:jc w:val="center"/>
+            </w:pPr>
+            <w:r>
+              <w:rPr>
+                <w:sz w:val="18"/>
+                <w:szCs w:val="18"/>
+              </w:rPr>
+              <w:t xml:space="preserve">31%</w:t>
+            </w:r>
+          </w:p>
+        </w:tc>
+      </w:tr>
+      <w:tr>
+        <w:tc>
+          <w:tcPr>
+            <w:tcW w:type="dxa" w:w="1900"/>
+            <w:shd w:fill="F7F8FA" w:val="clear"/>
+            <w:tcMar>
+              <w:top w:type="dxa" w:w="80"/>
+              <w:left w:type="dxa" w:w="120"/>
+              <w:bottom w:type="dxa" w:w="80"/>
+              <w:right w:type="dxa" w:w="120"/>
+            </w:tcMar>
+          </w:tcPr>
+          <w:p>
+            <w:pPr>
+              <w:spacing w:after="0" w:line="252"/>
+            </w:pPr>
+            <w:r>
+              <w:rPr>
+                <w:sz w:val="18"/>
+                <w:szCs w:val="18"/>
+              </w:rPr>
+              <w:t xml:space="preserve">prontoqa</w:t>
+            </w:r>
+          </w:p>
+        </w:tc>
+        <w:tc>
+          <w:tcPr>
+            <w:tcW w:type="dxa" w:w="1750"/>
+            <w:shd w:fill="F7F8FA" w:val="clear"/>
+            <w:tcMar>
+              <w:top w:type="dxa" w:w="80"/>
+              <w:left w:type="dxa" w:w="120"/>
+              <w:bottom w:type="dxa" w:w="80"/>
+              <w:right w:type="dxa" w:w="120"/>
+            </w:tcMar>
+          </w:tcPr>
+          <w:p>
+            <w:pPr>
+              <w:spacing w:after="0" w:line="252"/>
+              <w:jc w:val="center"/>
+            </w:pPr>
+            <w:r>
+              <w:rPr>
+                <w:sz w:val="18"/>
+                <w:szCs w:val="18"/>
+              </w:rPr>
+              <w:t xml:space="preserve">gpt-4o-mini</w:t>
+            </w:r>
+          </w:p>
+        </w:tc>
+        <w:tc>
+          <w:tcPr>
+            <w:tcW w:type="dxa" w:w="700"/>
+            <w:shd w:fill="F7F8FA" w:val="clear"/>
+            <w:tcMar>
+              <w:top w:type="dxa" w:w="80"/>
+              <w:left w:type="dxa" w:w="120"/>
+              <w:bottom w:type="dxa" w:w="80"/>
+              <w:right w:type="dxa" w:w="120"/>
+            </w:tcMar>
+          </w:tcPr>
+          <w:p>
+            <w:pPr>
+              <w:spacing w:after="0" w:line="252"/>
+              <w:jc w:val="center"/>
+            </w:pPr>
+            <w:r>
+              <w:rPr>
+                <w:sz w:val="18"/>
+                <w:szCs w:val="18"/>
+              </w:rPr>
+              <w:t xml:space="preserve">500</w:t>
+            </w:r>
+          </w:p>
+        </w:tc>
+        <w:tc>
+          <w:tcPr>
+            <w:tcW w:type="dxa" w:w="1176"/>
+            <w:shd w:fill="F7F8FA" w:val="clear"/>
+            <w:tcMar>
+              <w:top w:type="dxa" w:w="80"/>
+              <w:left w:type="dxa" w:w="120"/>
+              <w:bottom w:type="dxa" w:w="80"/>
+              <w:right w:type="dxa" w:w="120"/>
+            </w:tcMar>
+          </w:tcPr>
+          <w:p>
+            <w:pPr>
+              <w:spacing w:after="0" w:line="252"/>
+              <w:jc w:val="center"/>
+            </w:pPr>
+            <w:r>
+              <w:rPr>
+                <w:sz w:val="18"/>
+                <w:szCs w:val="18"/>
+              </w:rPr>
+              <w:t xml:space="preserve">90%</w:t>
+            </w:r>
+          </w:p>
+        </w:tc>
+        <w:tc>
+          <w:tcPr>
+            <w:tcW w:type="dxa" w:w="1200"/>
+            <w:shd w:fill="F7F8FA" w:val="clear"/>
+            <w:tcMar>
+              <w:top w:type="dxa" w:w="80"/>
+              <w:left w:type="dxa" w:w="120"/>
+              <w:bottom w:type="dxa" w:w="80"/>
+              <w:right w:type="dxa" w:w="120"/>
+            </w:tcMar>
+          </w:tcPr>
+          <w:p>
+            <w:pPr>
+              <w:spacing w:after="0" w:line="252"/>
+              <w:jc w:val="center"/>
+            </w:pPr>
+            <w:r>
+              <w:rPr>
+                <w:sz w:val="18"/>
+                <w:szCs w:val="18"/>
+              </w:rPr>
+              <w:t xml:space="preserve">10%</w:t>
+            </w:r>
+          </w:p>
+        </w:tc>
+        <w:tc>
+          <w:tcPr>
+            <w:tcW w:type="dxa" w:w="1150"/>
+            <w:shd w:fill="F7F8FA" w:val="clear"/>
+            <w:tcMar>
+              <w:top w:type="dxa" w:w="80"/>
+              <w:left w:type="dxa" w:w="120"/>
+              <w:bottom w:type="dxa" w:w="80"/>
+              <w:right w:type="dxa" w:w="120"/>
+            </w:tcMar>
+          </w:tcPr>
+          <w:p>
+            <w:pPr>
+              <w:spacing w:after="0" w:line="252"/>
+              <w:jc w:val="center"/>
+            </w:pPr>
+            <w:r>
+              <w:rPr>
+                <w:sz w:val="18"/>
+                <w:szCs w:val="18"/>
+              </w:rPr>
+              <w:t xml:space="preserve">1%</w:t>
+            </w:r>
+          </w:p>
+        </w:tc>
+        <w:tc>
+          <w:tcPr>
+            <w:tcW w:type="dxa" w:w="1150"/>
+            <w:shd w:fill="F7F8FA" w:val="clear"/>
+            <w:tcMar>
+              <w:top w:type="dxa" w:w="80"/>
+              <w:left w:type="dxa" w:w="120"/>
+              <w:bottom w:type="dxa" w:w="80"/>
+              <w:right w:type="dxa" w:w="120"/>
+            </w:tcMar>
+          </w:tcPr>
+          <w:p>
+            <w:pPr>
+              <w:spacing w:after="0" w:line="252"/>
+              <w:jc w:val="center"/>
+            </w:pPr>
+            <w:r>
+              <w:rPr>
+                <w:sz w:val="18"/>
+                <w:szCs w:val="18"/>
+              </w:rPr>
+              <w:t xml:space="preserve">9%</w:t>
+            </w:r>
+          </w:p>
+        </w:tc>
+      </w:tr>
+      <w:tr>
+        <w:tc>
+          <w:tcPr>
+            <w:tcW w:type="dxa" w:w="1900"/>
+            <w:shd w:fill="FFFFFF" w:val="clear"/>
+            <w:tcMar>
+              <w:top w:type="dxa" w:w="80"/>
+              <w:left w:type="dxa" w:w="120"/>
+              <w:bottom w:type="dxa" w:w="80"/>
+              <w:right w:type="dxa" w:w="120"/>
+            </w:tcMar>
+          </w:tcPr>
+          <w:p>
+            <w:pPr>
+              <w:spacing w:after="0" w:line="252"/>
+            </w:pPr>
+            <w:r>
+              <w:rPr>
+                <w:sz w:val="18"/>
+                <w:szCs w:val="18"/>
+              </w:rPr>
+              <w:t xml:space="preserve">prontoqa</w:t>
+            </w:r>
+          </w:p>
+        </w:tc>
+        <w:tc>
+          <w:tcPr>
+            <w:tcW w:type="dxa" w:w="1750"/>
+            <w:shd w:fill="FFFFFF" w:val="clear"/>
+            <w:tcMar>
+              <w:top w:type="dxa" w:w="80"/>
+              <w:left w:type="dxa" w:w="120"/>
+              <w:bottom w:type="dxa" w:w="80"/>
+              <w:right w:type="dxa" w:w="120"/>
+            </w:tcMar>
+          </w:tcPr>
+          <w:p>
+            <w:pPr>
+              <w:spacing w:after="0" w:line="252"/>
+              <w:jc w:val="center"/>
+            </w:pPr>
+            <w:r>
+              <w:rPr>
+                <w:sz w:val="18"/>
+                <w:szCs w:val="18"/>
+              </w:rPr>
+              <w:t xml:space="preserve">gpt-4o</w:t>
+            </w:r>
+          </w:p>
+        </w:tc>
+        <w:tc>
+          <w:tcPr>
+            <w:tcW w:type="dxa" w:w="700"/>
+            <w:shd w:fill="FFFFFF" w:val="clear"/>
+            <w:tcMar>
+              <w:top w:type="dxa" w:w="80"/>
+              <w:left w:type="dxa" w:w="120"/>
+              <w:bottom w:type="dxa" w:w="80"/>
+              <w:right w:type="dxa" w:w="120"/>
+            </w:tcMar>
+          </w:tcPr>
+          <w:p>
+            <w:pPr>
+              <w:spacing w:after="0" w:line="252"/>
+              <w:jc w:val="center"/>
+            </w:pPr>
+            <w:r>
+              <w:rPr>
+                <w:sz w:val="18"/>
+                <w:szCs w:val="18"/>
+              </w:rPr>
+              <w:t xml:space="preserve">500</w:t>
+            </w:r>
+          </w:p>
+        </w:tc>
+        <w:tc>
+          <w:tcPr>
+            <w:tcW w:type="dxa" w:w="1176"/>
+            <w:shd w:fill="FFFFFF" w:val="clear"/>
+            <w:tcMar>
+              <w:top w:type="dxa" w:w="80"/>
+              <w:left w:type="dxa" w:w="120"/>
+              <w:bottom w:type="dxa" w:w="80"/>
+              <w:right w:type="dxa" w:w="120"/>
+            </w:tcMar>
+          </w:tcPr>
+          <w:p>
+            <w:pPr>
+              <w:spacing w:after="0" w:line="252"/>
+              <w:jc w:val="center"/>
+            </w:pPr>
+            <w:r>
+              <w:rPr>
+                <w:sz w:val="18"/>
+                <w:szCs w:val="18"/>
+              </w:rPr>
+              <w:t xml:space="preserve">100%</w:t>
+            </w:r>
+          </w:p>
+        </w:tc>
+        <w:tc>
+          <w:tcPr>
+            <w:tcW w:type="dxa" w:w="1200"/>
+            <w:shd w:fill="FFFFFF" w:val="clear"/>
+            <w:tcMar>
+              <w:top w:type="dxa" w:w="80"/>
+              <w:left w:type="dxa" w:w="120"/>
+              <w:bottom w:type="dxa" w:w="80"/>
+              <w:right w:type="dxa" w:w="120"/>
+            </w:tcMar>
+          </w:tcPr>
+          <w:p>
+            <w:pPr>
+              <w:spacing w:after="0" w:line="252"/>
+              <w:jc w:val="center"/>
+            </w:pPr>
+            <w:r>
+              <w:rPr>
+                <w:b/>
+                <w:bCs/>
+                <w:color w:val="1E6B34"/>
+                <w:sz w:val="18"/>
+                <w:szCs w:val="18"/>
+              </w:rPr>
+              <w:t xml:space="preserve">0%</w:t>
+            </w:r>
+          </w:p>
+        </w:tc>
+        <w:tc>
+          <w:tcPr>
+            <w:tcW w:type="dxa" w:w="1150"/>
+            <w:shd w:fill="FFFFFF" w:val="clear"/>
+            <w:tcMar>
+              <w:top w:type="dxa" w:w="80"/>
+              <w:left w:type="dxa" w:w="120"/>
+              <w:bottom w:type="dxa" w:w="80"/>
+              <w:right w:type="dxa" w:w="120"/>
+            </w:tcMar>
+          </w:tcPr>
+          <w:p>
+            <w:pPr>
+              <w:spacing w:after="0" w:line="252"/>
+              <w:jc w:val="center"/>
+            </w:pPr>
+            <w:r>
+              <w:rPr>
+                <w:sz w:val="18"/>
+                <w:szCs w:val="18"/>
+              </w:rPr>
+              <w:t xml:space="preserve">0%</w:t>
+            </w:r>
+          </w:p>
+        </w:tc>
+        <w:tc>
+          <w:tcPr>
+            <w:tcW w:type="dxa" w:w="1150"/>
+            <w:shd w:fill="FFFFFF" w:val="clear"/>
+            <w:tcMar>
+              <w:top w:type="dxa" w:w="80"/>
+              <w:left w:type="dxa" w:w="120"/>
+              <w:bottom w:type="dxa" w:w="80"/>
+              <w:right w:type="dxa" w:w="120"/>
+            </w:tcMar>
+          </w:tcPr>
+          <w:p>
+            <w:pPr>
+              <w:spacing w:after="0" w:line="252"/>
+              <w:jc w:val="center"/>
+            </w:pPr>
+            <w:r>
+              <w:rPr>
+                <w:sz w:val="18"/>
+                <w:szCs w:val="18"/>
+              </w:rPr>
+              <w:t xml:space="preserve">0%</w:t>
+            </w:r>
+          </w:p>
+        </w:tc>
+      </w:tr>
+    </w:tbl>
+    <w:p>
+      <w:pPr>
+        <w:spacing w:after="120"/>
+      </w:pPr>
+    </w:p>
+    <w:tbl>
+      <w:tblPr>
+        <w:tblW w:type="dxa" w:w="9026"/>
+        <w:tblBorders>
+          <w:top w:val="single" w:color="1E6B34" w:sz="2"/>
+          <w:left w:val="single" w:color="1E6B34" w:sz="18"/>
+          <w:bottom w:val="single" w:color="1E6B34" w:sz="2"/>
+          <w:right w:val="single" w:color="1E6B34" w:sz="2"/>
+          <w:insideH w:val="none"/>
+          <w:insideV w:val="none"/>
+        </w:tblBorders>
+      </w:tblPr>
+      <w:tblGrid>
+        <w:gridCol w:w="9026"/>
+      </w:tblGrid>
+      <w:tr>
+        <w:tc>
+          <w:tcPr>
+            <w:tcW w:type="dxa" w:w="9026"/>
+            <w:shd w:fill="EAF6EE" w:val="clear"/>
+            <w:tcMar>
+              <w:top w:type="dxa" w:w="140"/>
+              <w:left w:type="dxa" w:w="200"/>
+              <w:bottom w:type="dxa" w:w="140"/>
+              <w:right w:type="dxa" w:w="200"/>
+            </w:tcMar>
+          </w:tcPr>
+          <w:p>
+            <w:pPr>
+              <w:spacing w:after="60"/>
+            </w:pPr>
+            <w:r>
+              <w:rPr>
+                <w:b/>
+                <w:bCs/>
+                <w:color w:val="1E6B34"/>
+                <w:sz w:val="21"/>
+                <w:szCs w:val="21"/>
+              </w:rPr>
+              <w:t xml:space="preserve">The headline finding</w:t>
+            </w:r>
+          </w:p>
+          <w:p>
+            <w:pPr>
+              <w:spacing w:after="60" w:line="276"/>
+            </w:pPr>
+            <w:r>
+              <w:rPr>
+                <w:sz w:val="20"/>
+                <w:szCs w:val="20"/>
+              </w:rPr>
+              <w:t xml:space="preserve">PrOntoQA and FOLIO have near-identical weak-model prevalence (36% vs 40% silent) but opposite responses to scale. Moving to gpt-4o eliminates silent failure on synthetic PrOntoQA (36% → 0%) yet leaves a large residue on naturalistic FOLIO (40% → 29%).</w:t>
+            </w:r>
+          </w:p>
+          <w:p>
+            <w:pPr>
+              <w:spacing w:after="60" w:line="276"/>
+            </w:pPr>
+            <w:r>
+              <w:rPr>
+                <w:sz w:val="20"/>
+                <w:szCs w:val="20"/>
+              </w:rPr>
+              <w:t xml:space="preserve">The phenomenon is capability-REMOVABLE on synthetic logical reasoning and capability-RESISTANT on naturalistic autoformalization. The two synthetic datasets act as controls that isolate the cause: the failure is driven by naturalistic language complexity, not logical depth. This is a cleaner and more defensible claim than 'silent failure is a general danger', which the frontier results falsified.</w:t>
+            </w:r>
+          </w:p>
+        </w:tc>
+      </w:tr>
+    </w:tbl>
+    <w:p>
+      <w:pPr>
+        <w:pStyle w:val="Heading2"/>
+        <w:spacing w:after="140" w:before="260"/>
+      </w:pPr>
+      <w:r>
+        <w:rPr>
+          <w:b/>
+          <w:bCs/>
+          <w:color w:val="1F3864"/>
+          <w:sz w:val="25"/>
+          <w:szCs w:val="25"/>
+        </w:rPr>
+        <w:t xml:space="preserve">10.2 Self-Refine gate across the matrix</w:t>
+      </w:r>
+    </w:p>
+    <w:p>
+      <w:pPr>
+        <w:spacing w:after="120" w:line="276"/>
+      </w:pPr>
+      <w:r>
+        <w:rPr>
+          <w:sz w:val="21"/>
+          <w:szCs w:val="21"/>
+        </w:rPr>
+        <w:t xml:space="preserve">Paired McNemar exact on the not-silent-failure endpoint (p &gt; 0.05 = no significant change in silent rate); net = helped − hurt on accuracy.</w:t>
+      </w:r>
+    </w:p>
+    <w:tbl>
+      <w:tblPr>
+        <w:tblW w:type="dxa" w:w="9026"/>
+        <w:tblBorders>
+          <w:top w:val="single" w:color="auto" w:sz="4"/>
+          <w:left w:val="single" w:color="auto" w:sz="4"/>
+          <w:bottom w:val="single" w:color="auto" w:sz="4"/>
+          <w:right w:val="single" w:color="auto" w:sz="4"/>
+          <w:insideH w:val="single" w:color="auto" w:sz="4"/>
+          <w:insideV w:val="single" w:color="auto" w:sz="4"/>
+        </w:tblBorders>
+      </w:tblPr>
+      <w:tblGrid>
+        <w:gridCol w:w="1750"/>
+        <w:gridCol w:w="1650"/>
+        <w:gridCol w:w="700"/>
+        <w:gridCol w:w="1476"/>
+        <w:gridCol w:w="1450"/>
+        <w:gridCol w:w="800"/>
+        <w:gridCol w:w="1200"/>
+      </w:tblGrid>
+      <w:tr>
+        <w:trPr>
+          <w:tblHeader/>
+        </w:trPr>
+        <w:tc>
+          <w:tcPr>
+            <w:tcW w:type="dxa" w:w="1750"/>
+            <w:shd w:fill="1F3864" w:val="clear"/>
+            <w:tcMar>
+              <w:top w:type="dxa" w:w="90"/>
+              <w:left w:type="dxa" w:w="120"/>
+              <w:bottom w:type="dxa" w:w="90"/>
+              <w:right w:type="dxa" w:w="120"/>
+            </w:tcMar>
+          </w:tcPr>
+          <w:p>
+            <w:pPr>
+              <w:spacing w:after="0"/>
+            </w:pPr>
+            <w:r>
+              <w:rPr>
+                <w:b/>
+                <w:bCs/>
+                <w:color w:val="FFFFFF"/>
+                <w:sz w:val="18"/>
+                <w:szCs w:val="18"/>
+              </w:rPr>
+              <w:t xml:space="preserve">dataset</w:t>
+            </w:r>
+          </w:p>
+        </w:tc>
+        <w:tc>
+          <w:tcPr>
+            <w:tcW w:type="dxa" w:w="1650"/>
+            <w:shd w:fill="1F3864" w:val="clear"/>
+            <w:tcMar>
+              <w:top w:type="dxa" w:w="90"/>
+              <w:left w:type="dxa" w:w="120"/>
+              <w:bottom w:type="dxa" w:w="90"/>
+              <w:right w:type="dxa" w:w="120"/>
+            </w:tcMar>
+          </w:tcPr>
+          <w:p>
+            <w:pPr>
+              <w:spacing w:after="0"/>
+              <w:jc w:val="center"/>
+            </w:pPr>
+            <w:r>
+              <w:rPr>
+                <w:b/>
+                <w:bCs/>
+                <w:color w:val="FFFFFF"/>
+                <w:sz w:val="18"/>
+                <w:szCs w:val="18"/>
+              </w:rPr>
+              <w:t xml:space="preserve">model</w:t>
+            </w:r>
+          </w:p>
+        </w:tc>
+        <w:tc>
+          <w:tcPr>
+            <w:tcW w:type="dxa" w:w="700"/>
+            <w:shd w:fill="1F3864" w:val="clear"/>
+            <w:tcMar>
+              <w:top w:type="dxa" w:w="90"/>
+              <w:left w:type="dxa" w:w="120"/>
+              <w:bottom w:type="dxa" w:w="90"/>
+              <w:right w:type="dxa" w:w="120"/>
+            </w:tcMar>
+          </w:tcPr>
+          <w:p>
+            <w:pPr>
+              <w:spacing w:after="0"/>
+              <w:jc w:val="center"/>
+            </w:pPr>
+            <w:r>
+              <w:rPr>
+                <w:b/>
+                <w:bCs/>
+                <w:color w:val="FFFFFF"/>
+                <w:sz w:val="18"/>
+                <w:szCs w:val="18"/>
+              </w:rPr>
+              <w:t xml:space="preserve">n</w:t>
+            </w:r>
+          </w:p>
+        </w:tc>
+        <w:tc>
+          <w:tcPr>
+            <w:tcW w:type="dxa" w:w="1476"/>
+            <w:shd w:fill="1F3864" w:val="clear"/>
+            <w:tcMar>
+              <w:top w:type="dxa" w:w="90"/>
+              <w:left w:type="dxa" w:w="120"/>
+              <w:bottom w:type="dxa" w:w="90"/>
+              <w:right w:type="dxa" w:w="120"/>
+            </w:tcMar>
+          </w:tcPr>
+          <w:p>
+            <w:pPr>
+              <w:spacing w:after="0"/>
+              <w:jc w:val="center"/>
+            </w:pPr>
+            <w:r>
+              <w:rPr>
+                <w:b/>
+                <w:bCs/>
+                <w:color w:val="FFFFFF"/>
+                <w:sz w:val="18"/>
+                <w:szCs w:val="18"/>
+              </w:rPr>
+              <w:t xml:space="preserve">vanilla silent</w:t>
+            </w:r>
+          </w:p>
+        </w:tc>
+        <w:tc>
+          <w:tcPr>
+            <w:tcW w:type="dxa" w:w="1450"/>
+            <w:shd w:fill="1F3864" w:val="clear"/>
+            <w:tcMar>
+              <w:top w:type="dxa" w:w="90"/>
+              <w:left w:type="dxa" w:w="120"/>
+              <w:bottom w:type="dxa" w:w="90"/>
+              <w:right w:type="dxa" w:w="120"/>
+            </w:tcMar>
+          </w:tcPr>
+          <w:p>
+            <w:pPr>
+              <w:spacing w:after="0"/>
+              <w:jc w:val="center"/>
+            </w:pPr>
+            <w:r>
+              <w:rPr>
+                <w:b/>
+                <w:bCs/>
+                <w:color w:val="FFFFFF"/>
+                <w:sz w:val="18"/>
+                <w:szCs w:val="18"/>
+              </w:rPr>
+              <w:t xml:space="preserve">refined silent</w:t>
+            </w:r>
+          </w:p>
+        </w:tc>
+        <w:tc>
+          <w:tcPr>
+            <w:tcW w:type="dxa" w:w="800"/>
+            <w:shd w:fill="1F3864" w:val="clear"/>
+            <w:tcMar>
+              <w:top w:type="dxa" w:w="90"/>
+              <w:left w:type="dxa" w:w="120"/>
+              <w:bottom w:type="dxa" w:w="90"/>
+              <w:right w:type="dxa" w:w="120"/>
+            </w:tcMar>
+          </w:tcPr>
+          <w:p>
+            <w:pPr>
+              <w:spacing w:after="0"/>
+              <w:jc w:val="center"/>
+            </w:pPr>
+            <w:r>
+              <w:rPr>
+                <w:b/>
+                <w:bCs/>
+                <w:color w:val="FFFFFF"/>
+                <w:sz w:val="18"/>
+                <w:szCs w:val="18"/>
+              </w:rPr>
+              <w:t xml:space="preserve">net</w:t>
+            </w:r>
+          </w:p>
+        </w:tc>
+        <w:tc>
+          <w:tcPr>
+            <w:tcW w:type="dxa" w:w="1200"/>
+            <w:shd w:fill="1F3864" w:val="clear"/>
+            <w:tcMar>
+              <w:top w:type="dxa" w:w="90"/>
+              <w:left w:type="dxa" w:w="120"/>
+              <w:bottom w:type="dxa" w:w="90"/>
+              <w:right w:type="dxa" w:w="120"/>
+            </w:tcMar>
+          </w:tcPr>
+          <w:p>
+            <w:pPr>
+              <w:spacing w:after="0"/>
+              <w:jc w:val="center"/>
+            </w:pPr>
+            <w:r>
+              <w:rPr>
+                <w:b/>
+                <w:bCs/>
+                <w:color w:val="FFFFFF"/>
+                <w:sz w:val="18"/>
+                <w:szCs w:val="18"/>
+              </w:rPr>
+              <w:t xml:space="preserve">McNemar p</w:t>
+            </w:r>
+          </w:p>
+        </w:tc>
+      </w:tr>
+      <w:tr>
+        <w:tc>
+          <w:tcPr>
+            <w:tcW w:type="dxa" w:w="1750"/>
+            <w:shd w:fill="FFFFFF" w:val="clear"/>
+            <w:tcMar>
+              <w:top w:type="dxa" w:w="80"/>
+              <w:left w:type="dxa" w:w="120"/>
+              <w:bottom w:type="dxa" w:w="80"/>
+              <w:right w:type="dxa" w:w="120"/>
+            </w:tcMar>
+          </w:tcPr>
+          <w:p>
+            <w:pPr>
+              <w:spacing w:after="0" w:line="252"/>
+            </w:pPr>
+            <w:r>
+              <w:rPr>
+                <w:sz w:val="18"/>
+                <w:szCs w:val="18"/>
+              </w:rPr>
+              <w:t xml:space="preserve">folio</w:t>
+            </w:r>
+          </w:p>
+        </w:tc>
+        <w:tc>
+          <w:tcPr>
+            <w:tcW w:type="dxa" w:w="1650"/>
+            <w:shd w:fill="FFFFFF" w:val="clear"/>
+            <w:tcMar>
+              <w:top w:type="dxa" w:w="80"/>
+              <w:left w:type="dxa" w:w="120"/>
+              <w:bottom w:type="dxa" w:w="80"/>
+              <w:right w:type="dxa" w:w="120"/>
+            </w:tcMar>
+          </w:tcPr>
+          <w:p>
+            <w:pPr>
+              <w:spacing w:after="0" w:line="252"/>
+              <w:jc w:val="center"/>
+            </w:pPr>
+            <w:r>
+              <w:rPr>
+                <w:sz w:val="18"/>
+                <w:szCs w:val="18"/>
+              </w:rPr>
+              <w:t xml:space="preserve">Llama-3.1-8B</w:t>
+            </w:r>
+          </w:p>
+        </w:tc>
+        <w:tc>
+          <w:tcPr>
+            <w:tcW w:type="dxa" w:w="700"/>
+            <w:shd w:fill="FFFFFF" w:val="clear"/>
+            <w:tcMar>
+              <w:top w:type="dxa" w:w="80"/>
+              <w:left w:type="dxa" w:w="120"/>
+              <w:bottom w:type="dxa" w:w="80"/>
+              <w:right w:type="dxa" w:w="120"/>
+            </w:tcMar>
+          </w:tcPr>
+          <w:p>
+            <w:pPr>
+              <w:spacing w:after="0" w:line="252"/>
+              <w:jc w:val="center"/>
+            </w:pPr>
+            <w:r>
+              <w:rPr>
+                <w:sz w:val="18"/>
+                <w:szCs w:val="18"/>
+              </w:rPr>
+              <w:t xml:space="preserve">203</w:t>
+            </w:r>
+          </w:p>
+        </w:tc>
+        <w:tc>
+          <w:tcPr>
+            <w:tcW w:type="dxa" w:w="1476"/>
+            <w:shd w:fill="FFFFFF" w:val="clear"/>
+            <w:tcMar>
+              <w:top w:type="dxa" w:w="80"/>
+              <w:left w:type="dxa" w:w="120"/>
+              <w:bottom w:type="dxa" w:w="80"/>
+              <w:right w:type="dxa" w:w="120"/>
+            </w:tcMar>
+          </w:tcPr>
+          <w:p>
+            <w:pPr>
+              <w:spacing w:after="0" w:line="252"/>
+              <w:jc w:val="center"/>
+            </w:pPr>
+            <w:r>
+              <w:rPr>
+                <w:sz w:val="18"/>
+                <w:szCs w:val="18"/>
+              </w:rPr>
+              <w:t xml:space="preserve">40%</w:t>
+            </w:r>
+          </w:p>
+        </w:tc>
+        <w:tc>
+          <w:tcPr>
+            <w:tcW w:type="dxa" w:w="1450"/>
+            <w:shd w:fill="FFFFFF" w:val="clear"/>
+            <w:tcMar>
+              <w:top w:type="dxa" w:w="80"/>
+              <w:left w:type="dxa" w:w="120"/>
+              <w:bottom w:type="dxa" w:w="80"/>
+              <w:right w:type="dxa" w:w="120"/>
+            </w:tcMar>
+          </w:tcPr>
+          <w:p>
+            <w:pPr>
+              <w:spacing w:after="0" w:line="252"/>
+              <w:jc w:val="center"/>
+            </w:pPr>
+            <w:r>
+              <w:rPr>
+                <w:sz w:val="18"/>
+                <w:szCs w:val="18"/>
+              </w:rPr>
+              <w:t xml:space="preserve">49%</w:t>
+            </w:r>
+          </w:p>
+        </w:tc>
+        <w:tc>
+          <w:tcPr>
+            <w:tcW w:type="dxa" w:w="800"/>
+            <w:shd w:fill="FFFFFF" w:val="clear"/>
+            <w:tcMar>
+              <w:top w:type="dxa" w:w="80"/>
+              <w:left w:type="dxa" w:w="120"/>
+              <w:bottom w:type="dxa" w:w="80"/>
+              <w:right w:type="dxa" w:w="120"/>
+            </w:tcMar>
+          </w:tcPr>
+          <w:p>
+            <w:pPr>
+              <w:spacing w:after="0" w:line="252"/>
+              <w:jc w:val="center"/>
+            </w:pPr>
+            <w:r>
+              <w:rPr>
+                <w:b/>
+                <w:bCs/>
+                <w:color w:val="9C1F1F"/>
+                <w:sz w:val="18"/>
+                <w:szCs w:val="18"/>
+              </w:rPr>
+              <w:t xml:space="preserve">−31</w:t>
+            </w:r>
+          </w:p>
+        </w:tc>
+        <w:tc>
+          <w:tcPr>
+            <w:tcW w:type="dxa" w:w="1200"/>
+            <w:shd w:fill="FFFFFF" w:val="clear"/>
+            <w:tcMar>
+              <w:top w:type="dxa" w:w="80"/>
+              <w:left w:type="dxa" w:w="120"/>
+              <w:bottom w:type="dxa" w:w="80"/>
+              <w:right w:type="dxa" w:w="120"/>
+            </w:tcMar>
+          </w:tcPr>
+          <w:p>
+            <w:pPr>
+              <w:spacing w:after="0" w:line="252"/>
+              <w:jc w:val="center"/>
+            </w:pPr>
+            <w:r>
+              <w:rPr>
+                <w:sz w:val="18"/>
+                <w:szCs w:val="18"/>
+              </w:rPr>
+              <w:t xml:space="preserve">1.000</w:t>
+            </w:r>
+          </w:p>
+        </w:tc>
+      </w:tr>
+      <w:tr>
+        <w:tc>
+          <w:tcPr>
+            <w:tcW w:type="dxa" w:w="1750"/>
+            <w:shd w:fill="F7F8FA" w:val="clear"/>
+            <w:tcMar>
+              <w:top w:type="dxa" w:w="80"/>
+              <w:left w:type="dxa" w:w="120"/>
+              <w:bottom w:type="dxa" w:w="80"/>
+              <w:right w:type="dxa" w:w="120"/>
+            </w:tcMar>
+          </w:tcPr>
+          <w:p>
+            <w:pPr>
+              <w:spacing w:after="0" w:line="252"/>
+            </w:pPr>
+            <w:r>
+              <w:rPr>
+                <w:sz w:val="18"/>
+                <w:szCs w:val="18"/>
+              </w:rPr>
+              <w:t xml:space="preserve">folio</w:t>
+            </w:r>
+          </w:p>
+        </w:tc>
+        <w:tc>
+          <w:tcPr>
+            <w:tcW w:type="dxa" w:w="1650"/>
+            <w:shd w:fill="F7F8FA" w:val="clear"/>
+            <w:tcMar>
+              <w:top w:type="dxa" w:w="80"/>
+              <w:left w:type="dxa" w:w="120"/>
+              <w:bottom w:type="dxa" w:w="80"/>
+              <w:right w:type="dxa" w:w="120"/>
+            </w:tcMar>
+          </w:tcPr>
+          <w:p>
+            <w:pPr>
+              <w:spacing w:after="0" w:line="252"/>
+              <w:jc w:val="center"/>
+            </w:pPr>
+            <w:r>
+              <w:rPr>
+                <w:sz w:val="18"/>
+                <w:szCs w:val="18"/>
+              </w:rPr>
+              <w:t xml:space="preserve">gpt-4o-mini</w:t>
+            </w:r>
+          </w:p>
+        </w:tc>
+        <w:tc>
+          <w:tcPr>
+            <w:tcW w:type="dxa" w:w="700"/>
+            <w:shd w:fill="F7F8FA" w:val="clear"/>
+            <w:tcMar>
+              <w:top w:type="dxa" w:w="80"/>
+              <w:left w:type="dxa" w:w="120"/>
+              <w:bottom w:type="dxa" w:w="80"/>
+              <w:right w:type="dxa" w:w="120"/>
+            </w:tcMar>
+          </w:tcPr>
+          <w:p>
+            <w:pPr>
+              <w:spacing w:after="0" w:line="252"/>
+              <w:jc w:val="center"/>
+            </w:pPr>
+            <w:r>
+              <w:rPr>
+                <w:sz w:val="18"/>
+                <w:szCs w:val="18"/>
+              </w:rPr>
+              <w:t xml:space="preserve">203</w:t>
+            </w:r>
+          </w:p>
+        </w:tc>
+        <w:tc>
+          <w:tcPr>
+            <w:tcW w:type="dxa" w:w="1476"/>
+            <w:shd w:fill="F7F8FA" w:val="clear"/>
+            <w:tcMar>
+              <w:top w:type="dxa" w:w="80"/>
+              <w:left w:type="dxa" w:w="120"/>
+              <w:bottom w:type="dxa" w:w="80"/>
+              <w:right w:type="dxa" w:w="120"/>
+            </w:tcMar>
+          </w:tcPr>
+          <w:p>
+            <w:pPr>
+              <w:spacing w:after="0" w:line="252"/>
+              <w:jc w:val="center"/>
+            </w:pPr>
+            <w:r>
+              <w:rPr>
+                <w:sz w:val="18"/>
+                <w:szCs w:val="18"/>
+              </w:rPr>
+              <w:t xml:space="preserve">39%</w:t>
+            </w:r>
+          </w:p>
+        </w:tc>
+        <w:tc>
+          <w:tcPr>
+            <w:tcW w:type="dxa" w:w="1450"/>
+            <w:shd w:fill="F7F8FA" w:val="clear"/>
+            <w:tcMar>
+              <w:top w:type="dxa" w:w="80"/>
+              <w:left w:type="dxa" w:w="120"/>
+              <w:bottom w:type="dxa" w:w="80"/>
+              <w:right w:type="dxa" w:w="120"/>
+            </w:tcMar>
+          </w:tcPr>
+          <w:p>
+            <w:pPr>
+              <w:spacing w:after="0" w:line="252"/>
+              <w:jc w:val="center"/>
+            </w:pPr>
+            <w:r>
+              <w:rPr>
+                <w:sz w:val="18"/>
+                <w:szCs w:val="18"/>
+              </w:rPr>
+              <w:t xml:space="preserve">42%</w:t>
+            </w:r>
+          </w:p>
+        </w:tc>
+        <w:tc>
+          <w:tcPr>
+            <w:tcW w:type="dxa" w:w="800"/>
+            <w:shd w:fill="F7F8FA" w:val="clear"/>
+            <w:tcMar>
+              <w:top w:type="dxa" w:w="80"/>
+              <w:left w:type="dxa" w:w="120"/>
+              <w:bottom w:type="dxa" w:w="80"/>
+              <w:right w:type="dxa" w:w="120"/>
+            </w:tcMar>
+          </w:tcPr>
+          <w:p>
+            <w:pPr>
+              <w:spacing w:after="0" w:line="252"/>
+              <w:jc w:val="center"/>
+            </w:pPr>
+            <w:r>
+              <w:rPr>
+                <w:sz w:val="18"/>
+                <w:szCs w:val="18"/>
+              </w:rPr>
+              <w:t xml:space="preserve">−10</w:t>
+            </w:r>
+          </w:p>
+        </w:tc>
+        <w:tc>
+          <w:tcPr>
+            <w:tcW w:type="dxa" w:w="1200"/>
+            <w:shd w:fill="F7F8FA" w:val="clear"/>
+            <w:tcMar>
+              <w:top w:type="dxa" w:w="80"/>
+              <w:left w:type="dxa" w:w="120"/>
+              <w:bottom w:type="dxa" w:w="80"/>
+              <w:right w:type="dxa" w:w="120"/>
+            </w:tcMar>
+          </w:tcPr>
+          <w:p>
+            <w:pPr>
+              <w:spacing w:after="0" w:line="252"/>
+              <w:jc w:val="center"/>
+            </w:pPr>
+            <w:r>
+              <w:rPr>
+                <w:sz w:val="18"/>
+                <w:szCs w:val="18"/>
+              </w:rPr>
+              <w:t xml:space="preserve">0.690</w:t>
+            </w:r>
+          </w:p>
+        </w:tc>
+      </w:tr>
+      <w:tr>
+        <w:tc>
+          <w:tcPr>
+            <w:tcW w:type="dxa" w:w="1750"/>
+            <w:shd w:fill="FFFFFF" w:val="clear"/>
+            <w:tcMar>
+              <w:top w:type="dxa" w:w="80"/>
+              <w:left w:type="dxa" w:w="120"/>
+              <w:bottom w:type="dxa" w:w="80"/>
+              <w:right w:type="dxa" w:w="120"/>
+            </w:tcMar>
+          </w:tcPr>
+          <w:p>
+            <w:pPr>
+              <w:spacing w:after="0" w:line="252"/>
+            </w:pPr>
+            <w:r>
+              <w:rPr>
+                <w:sz w:val="18"/>
+                <w:szCs w:val="18"/>
+              </w:rPr>
+              <w:t xml:space="preserve">folio</w:t>
+            </w:r>
+          </w:p>
+        </w:tc>
+        <w:tc>
+          <w:tcPr>
+            <w:tcW w:type="dxa" w:w="1650"/>
+            <w:shd w:fill="FFFFFF" w:val="clear"/>
+            <w:tcMar>
+              <w:top w:type="dxa" w:w="80"/>
+              <w:left w:type="dxa" w:w="120"/>
+              <w:bottom w:type="dxa" w:w="80"/>
+              <w:right w:type="dxa" w:w="120"/>
+            </w:tcMar>
+          </w:tcPr>
+          <w:p>
+            <w:pPr>
+              <w:spacing w:after="0" w:line="252"/>
+              <w:jc w:val="center"/>
+            </w:pPr>
+            <w:r>
+              <w:rPr>
+                <w:sz w:val="18"/>
+                <w:szCs w:val="18"/>
+              </w:rPr>
+              <w:t xml:space="preserve">gpt-4o</w:t>
+            </w:r>
+          </w:p>
+        </w:tc>
+        <w:tc>
+          <w:tcPr>
+            <w:tcW w:type="dxa" w:w="700"/>
+            <w:shd w:fill="FFFFFF" w:val="clear"/>
+            <w:tcMar>
+              <w:top w:type="dxa" w:w="80"/>
+              <w:left w:type="dxa" w:w="120"/>
+              <w:bottom w:type="dxa" w:w="80"/>
+              <w:right w:type="dxa" w:w="120"/>
+            </w:tcMar>
+          </w:tcPr>
+          <w:p>
+            <w:pPr>
+              <w:spacing w:after="0" w:line="252"/>
+              <w:jc w:val="center"/>
+            </w:pPr>
+            <w:r>
+              <w:rPr>
+                <w:sz w:val="18"/>
+                <w:szCs w:val="18"/>
+              </w:rPr>
+              <w:t xml:space="preserve">203</w:t>
+            </w:r>
+          </w:p>
+        </w:tc>
+        <w:tc>
+          <w:tcPr>
+            <w:tcW w:type="dxa" w:w="1476"/>
+            <w:shd w:fill="FFFFFF" w:val="clear"/>
+            <w:tcMar>
+              <w:top w:type="dxa" w:w="80"/>
+              <w:left w:type="dxa" w:w="120"/>
+              <w:bottom w:type="dxa" w:w="80"/>
+              <w:right w:type="dxa" w:w="120"/>
+            </w:tcMar>
+          </w:tcPr>
+          <w:p>
+            <w:pPr>
+              <w:spacing w:after="0" w:line="252"/>
+              <w:jc w:val="center"/>
+            </w:pPr>
+            <w:r>
+              <w:rPr>
+                <w:sz w:val="18"/>
+                <w:szCs w:val="18"/>
+              </w:rPr>
+              <w:t xml:space="preserve">29%</w:t>
+            </w:r>
+          </w:p>
+        </w:tc>
+        <w:tc>
+          <w:tcPr>
+            <w:tcW w:type="dxa" w:w="1450"/>
+            <w:shd w:fill="FFFFFF" w:val="clear"/>
+            <w:tcMar>
+              <w:top w:type="dxa" w:w="80"/>
+              <w:left w:type="dxa" w:w="120"/>
+              <w:bottom w:type="dxa" w:w="80"/>
+              <w:right w:type="dxa" w:w="120"/>
+            </w:tcMar>
+          </w:tcPr>
+          <w:p>
+            <w:pPr>
+              <w:spacing w:after="0" w:line="252"/>
+              <w:jc w:val="center"/>
+            </w:pPr>
+            <w:r>
+              <w:rPr>
+                <w:sz w:val="18"/>
+                <w:szCs w:val="18"/>
+              </w:rPr>
+              <w:t xml:space="preserve">29%</w:t>
+            </w:r>
+          </w:p>
+        </w:tc>
+        <w:tc>
+          <w:tcPr>
+            <w:tcW w:type="dxa" w:w="800"/>
+            <w:shd w:fill="FFFFFF" w:val="clear"/>
+            <w:tcMar>
+              <w:top w:type="dxa" w:w="80"/>
+              <w:left w:type="dxa" w:w="120"/>
+              <w:bottom w:type="dxa" w:w="80"/>
+              <w:right w:type="dxa" w:w="120"/>
+            </w:tcMar>
+          </w:tcPr>
+          <w:p>
+            <w:pPr>
+              <w:spacing w:after="0" w:line="252"/>
+              <w:jc w:val="center"/>
+            </w:pPr>
+            <w:r>
+              <w:rPr>
+                <w:sz w:val="18"/>
+                <w:szCs w:val="18"/>
+              </w:rPr>
+              <w:t xml:space="preserve">−3</w:t>
+            </w:r>
+          </w:p>
+        </w:tc>
+        <w:tc>
+          <w:tcPr>
+            <w:tcW w:type="dxa" w:w="1200"/>
+            <w:shd w:fill="FFFFFF" w:val="clear"/>
+            <w:tcMar>
+              <w:top w:type="dxa" w:w="80"/>
+              <w:left w:type="dxa" w:w="120"/>
+              <w:bottom w:type="dxa" w:w="80"/>
+              <w:right w:type="dxa" w:w="120"/>
+            </w:tcMar>
+          </w:tcPr>
+          <w:p>
+            <w:pPr>
+              <w:spacing w:after="0" w:line="252"/>
+              <w:jc w:val="center"/>
+            </w:pPr>
+            <w:r>
+              <w:rPr>
+                <w:sz w:val="18"/>
+                <w:szCs w:val="18"/>
+              </w:rPr>
+              <w:t xml:space="preserve">1.000</w:t>
+            </w:r>
+          </w:p>
+        </w:tc>
+      </w:tr>
+      <w:tr>
+        <w:tc>
+          <w:tcPr>
+            <w:tcW w:type="dxa" w:w="1750"/>
+            <w:shd w:fill="F7F8FA" w:val="clear"/>
+            <w:tcMar>
+              <w:top w:type="dxa" w:w="80"/>
+              <w:left w:type="dxa" w:w="120"/>
+              <w:bottom w:type="dxa" w:w="80"/>
+              <w:right w:type="dxa" w:w="120"/>
+            </w:tcMar>
+          </w:tcPr>
+          <w:p>
+            <w:pPr>
+              <w:spacing w:after="0" w:line="252"/>
+            </w:pPr>
+            <w:r>
+              <w:rPr>
+                <w:sz w:val="18"/>
+                <w:szCs w:val="18"/>
+              </w:rPr>
+              <w:t xml:space="preserve">proofwriter</w:t>
+            </w:r>
+          </w:p>
+        </w:tc>
+        <w:tc>
+          <w:tcPr>
+            <w:tcW w:type="dxa" w:w="1650"/>
+            <w:shd w:fill="F7F8FA" w:val="clear"/>
+            <w:tcMar>
+              <w:top w:type="dxa" w:w="80"/>
+              <w:left w:type="dxa" w:w="120"/>
+              <w:bottom w:type="dxa" w:w="80"/>
+              <w:right w:type="dxa" w:w="120"/>
+            </w:tcMar>
+          </w:tcPr>
+          <w:p>
+            <w:pPr>
+              <w:spacing w:after="0" w:line="252"/>
+              <w:jc w:val="center"/>
+            </w:pPr>
+            <w:r>
+              <w:rPr>
+                <w:sz w:val="18"/>
+                <w:szCs w:val="18"/>
+              </w:rPr>
+              <w:t xml:space="preserve">Llama-3.1-8B</w:t>
+            </w:r>
+          </w:p>
+        </w:tc>
+        <w:tc>
+          <w:tcPr>
+            <w:tcW w:type="dxa" w:w="700"/>
+            <w:shd w:fill="F7F8FA" w:val="clear"/>
+            <w:tcMar>
+              <w:top w:type="dxa" w:w="80"/>
+              <w:left w:type="dxa" w:w="120"/>
+              <w:bottom w:type="dxa" w:w="80"/>
+              <w:right w:type="dxa" w:w="120"/>
+            </w:tcMar>
+          </w:tcPr>
+          <w:p>
+            <w:pPr>
+              <w:spacing w:after="0" w:line="252"/>
+              <w:jc w:val="center"/>
+            </w:pPr>
+            <w:r>
+              <w:rPr>
+                <w:sz w:val="18"/>
+                <w:szCs w:val="18"/>
+              </w:rPr>
+              <w:t xml:space="preserve">100</w:t>
+            </w:r>
+          </w:p>
+        </w:tc>
+        <w:tc>
+          <w:tcPr>
+            <w:tcW w:type="dxa" w:w="1476"/>
+            <w:shd w:fill="F7F8FA" w:val="clear"/>
+            <w:tcMar>
+              <w:top w:type="dxa" w:w="80"/>
+              <w:left w:type="dxa" w:w="120"/>
+              <w:bottom w:type="dxa" w:w="80"/>
+              <w:right w:type="dxa" w:w="120"/>
+            </w:tcMar>
+          </w:tcPr>
+          <w:p>
+            <w:pPr>
+              <w:spacing w:after="0" w:line="252"/>
+              <w:jc w:val="center"/>
+            </w:pPr>
+            <w:r>
+              <w:rPr>
+                <w:sz w:val="18"/>
+                <w:szCs w:val="18"/>
+              </w:rPr>
+              <w:t xml:space="preserve">16%</w:t>
+            </w:r>
+          </w:p>
+        </w:tc>
+        <w:tc>
+          <w:tcPr>
+            <w:tcW w:type="dxa" w:w="1450"/>
+            <w:shd w:fill="F7F8FA" w:val="clear"/>
+            <w:tcMar>
+              <w:top w:type="dxa" w:w="80"/>
+              <w:left w:type="dxa" w:w="120"/>
+              <w:bottom w:type="dxa" w:w="80"/>
+              <w:right w:type="dxa" w:w="120"/>
+            </w:tcMar>
+          </w:tcPr>
+          <w:p>
+            <w:pPr>
+              <w:spacing w:after="0" w:line="252"/>
+              <w:jc w:val="center"/>
+            </w:pPr>
+            <w:r>
+              <w:rPr>
+                <w:sz w:val="18"/>
+                <w:szCs w:val="18"/>
+              </w:rPr>
+              <w:t xml:space="preserve">38%</w:t>
+            </w:r>
+          </w:p>
+        </w:tc>
+        <w:tc>
+          <w:tcPr>
+            <w:tcW w:type="dxa" w:w="800"/>
+            <w:shd w:fill="F7F8FA" w:val="clear"/>
+            <w:tcMar>
+              <w:top w:type="dxa" w:w="80"/>
+              <w:left w:type="dxa" w:w="120"/>
+              <w:bottom w:type="dxa" w:w="80"/>
+              <w:right w:type="dxa" w:w="120"/>
+            </w:tcMar>
+          </w:tcPr>
+          <w:p>
+            <w:pPr>
+              <w:spacing w:after="0" w:line="252"/>
+              <w:jc w:val="center"/>
+            </w:pPr>
+            <w:r>
+              <w:rPr>
+                <w:b/>
+                <w:bCs/>
+                <w:color w:val="9C1F1F"/>
+                <w:sz w:val="18"/>
+                <w:szCs w:val="18"/>
+              </w:rPr>
+              <w:t xml:space="preserve">−29</w:t>
+            </w:r>
+          </w:p>
+        </w:tc>
+        <w:tc>
+          <w:tcPr>
+            <w:tcW w:type="dxa" w:w="1200"/>
+            <w:shd w:fill="F7F8FA" w:val="clear"/>
+            <w:tcMar>
+              <w:top w:type="dxa" w:w="80"/>
+              <w:left w:type="dxa" w:w="120"/>
+              <w:bottom w:type="dxa" w:w="80"/>
+              <w:right w:type="dxa" w:w="120"/>
+            </w:tcMar>
+          </w:tcPr>
+          <w:p>
+            <w:pPr>
+              <w:spacing w:after="0" w:line="252"/>
+              <w:jc w:val="center"/>
+            </w:pPr>
+            <w:r>
+              <w:rPr>
+                <w:b/>
+                <w:bCs/>
+                <w:color w:val="9C1F1F"/>
+                <w:sz w:val="18"/>
+                <w:szCs w:val="18"/>
+              </w:rPr>
+              <w:t xml:space="preserve">0.000</w:t>
+            </w:r>
+          </w:p>
+        </w:tc>
+      </w:tr>
+      <w:tr>
+        <w:tc>
+          <w:tcPr>
+            <w:tcW w:type="dxa" w:w="1750"/>
+            <w:shd w:fill="FFFFFF" w:val="clear"/>
+            <w:tcMar>
+              <w:top w:type="dxa" w:w="80"/>
+              <w:left w:type="dxa" w:w="120"/>
+              <w:bottom w:type="dxa" w:w="80"/>
+              <w:right w:type="dxa" w:w="120"/>
+            </w:tcMar>
+          </w:tcPr>
+          <w:p>
+            <w:pPr>
+              <w:spacing w:after="0" w:line="252"/>
+            </w:pPr>
+            <w:r>
+              <w:rPr>
+                <w:sz w:val="18"/>
+                <w:szCs w:val="18"/>
+              </w:rPr>
+              <w:t xml:space="preserve">prontoqa</w:t>
+            </w:r>
+          </w:p>
+        </w:tc>
+        <w:tc>
+          <w:tcPr>
+            <w:tcW w:type="dxa" w:w="1650"/>
+            <w:shd w:fill="FFFFFF" w:val="clear"/>
+            <w:tcMar>
+              <w:top w:type="dxa" w:w="80"/>
+              <w:left w:type="dxa" w:w="120"/>
+              <w:bottom w:type="dxa" w:w="80"/>
+              <w:right w:type="dxa" w:w="120"/>
+            </w:tcMar>
+          </w:tcPr>
+          <w:p>
+            <w:pPr>
+              <w:spacing w:after="0" w:line="252"/>
+              <w:jc w:val="center"/>
+            </w:pPr>
+            <w:r>
+              <w:rPr>
+                <w:sz w:val="18"/>
+                <w:szCs w:val="18"/>
+              </w:rPr>
+              <w:t xml:space="preserve">Llama-3.1-8B</w:t>
+            </w:r>
+          </w:p>
+        </w:tc>
+        <w:tc>
+          <w:tcPr>
+            <w:tcW w:type="dxa" w:w="700"/>
+            <w:shd w:fill="FFFFFF" w:val="clear"/>
+            <w:tcMar>
+              <w:top w:type="dxa" w:w="80"/>
+              <w:left w:type="dxa" w:w="120"/>
+              <w:bottom w:type="dxa" w:w="80"/>
+              <w:right w:type="dxa" w:w="120"/>
+            </w:tcMar>
+          </w:tcPr>
+          <w:p>
+            <w:pPr>
+              <w:spacing w:after="0" w:line="252"/>
+              <w:jc w:val="center"/>
+            </w:pPr>
+            <w:r>
+              <w:rPr>
+                <w:sz w:val="18"/>
+                <w:szCs w:val="18"/>
+              </w:rPr>
+              <w:t xml:space="preserve">100</w:t>
+            </w:r>
+          </w:p>
+        </w:tc>
+        <w:tc>
+          <w:tcPr>
+            <w:tcW w:type="dxa" w:w="1476"/>
+            <w:shd w:fill="FFFFFF" w:val="clear"/>
+            <w:tcMar>
+              <w:top w:type="dxa" w:w="80"/>
+              <w:left w:type="dxa" w:w="120"/>
+              <w:bottom w:type="dxa" w:w="80"/>
+              <w:right w:type="dxa" w:w="120"/>
+            </w:tcMar>
+          </w:tcPr>
+          <w:p>
+            <w:pPr>
+              <w:spacing w:after="0" w:line="252"/>
+              <w:jc w:val="center"/>
+            </w:pPr>
+            <w:r>
+              <w:rPr>
+                <w:sz w:val="18"/>
+                <w:szCs w:val="18"/>
+              </w:rPr>
+              <w:t xml:space="preserve">40%</w:t>
+            </w:r>
+          </w:p>
+        </w:tc>
+        <w:tc>
+          <w:tcPr>
+            <w:tcW w:type="dxa" w:w="1450"/>
+            <w:shd w:fill="FFFFFF" w:val="clear"/>
+            <w:tcMar>
+              <w:top w:type="dxa" w:w="80"/>
+              <w:left w:type="dxa" w:w="120"/>
+              <w:bottom w:type="dxa" w:w="80"/>
+              <w:right w:type="dxa" w:w="120"/>
+            </w:tcMar>
+          </w:tcPr>
+          <w:p>
+            <w:pPr>
+              <w:spacing w:after="0" w:line="252"/>
+              <w:jc w:val="center"/>
+            </w:pPr>
+            <w:r>
+              <w:rPr>
+                <w:sz w:val="18"/>
+                <w:szCs w:val="18"/>
+              </w:rPr>
+              <w:t xml:space="preserve">39%</w:t>
+            </w:r>
+          </w:p>
+        </w:tc>
+        <w:tc>
+          <w:tcPr>
+            <w:tcW w:type="dxa" w:w="800"/>
+            <w:shd w:fill="FFFFFF" w:val="clear"/>
+            <w:tcMar>
+              <w:top w:type="dxa" w:w="80"/>
+              <w:left w:type="dxa" w:w="120"/>
+              <w:bottom w:type="dxa" w:w="80"/>
+              <w:right w:type="dxa" w:w="120"/>
+            </w:tcMar>
+          </w:tcPr>
+          <w:p>
+            <w:pPr>
+              <w:spacing w:after="0" w:line="252"/>
+              <w:jc w:val="center"/>
+            </w:pPr>
+            <w:r>
+              <w:rPr>
+                <w:sz w:val="18"/>
+                <w:szCs w:val="18"/>
+              </w:rPr>
+              <w:t xml:space="preserve">−5</w:t>
+            </w:r>
+          </w:p>
+        </w:tc>
+        <w:tc>
+          <w:tcPr>
+            <w:tcW w:type="dxa" w:w="1200"/>
+            <w:shd w:fill="FFFFFF" w:val="clear"/>
+            <w:tcMar>
+              <w:top w:type="dxa" w:w="80"/>
+              <w:left w:type="dxa" w:w="120"/>
+              <w:bottom w:type="dxa" w:w="80"/>
+              <w:right w:type="dxa" w:w="120"/>
+            </w:tcMar>
+          </w:tcPr>
+          <w:p>
+            <w:pPr>
+              <w:spacing w:after="0" w:line="252"/>
+              <w:jc w:val="center"/>
+            </w:pPr>
+            <w:r>
+              <w:rPr>
+                <w:sz w:val="18"/>
+                <w:szCs w:val="18"/>
+              </w:rPr>
+              <w:t xml:space="preserve">0.392</w:t>
+            </w:r>
+          </w:p>
+        </w:tc>
+      </w:tr>
+      <w:tr>
+        <w:tc>
+          <w:tcPr>
+            <w:tcW w:type="dxa" w:w="1750"/>
+            <w:shd w:fill="F7F8FA" w:val="clear"/>
+            <w:tcMar>
+              <w:top w:type="dxa" w:w="80"/>
+              <w:left w:type="dxa" w:w="120"/>
+              <w:bottom w:type="dxa" w:w="80"/>
+              <w:right w:type="dxa" w:w="120"/>
+            </w:tcMar>
+          </w:tcPr>
+          <w:p>
+            <w:pPr>
+              <w:spacing w:after="0" w:line="252"/>
+            </w:pPr>
+            <w:r>
+              <w:rPr>
+                <w:sz w:val="18"/>
+                <w:szCs w:val="18"/>
+              </w:rPr>
+              <w:t xml:space="preserve">prontoqa</w:t>
+            </w:r>
+          </w:p>
+        </w:tc>
+        <w:tc>
+          <w:tcPr>
+            <w:tcW w:type="dxa" w:w="1650"/>
+            <w:shd w:fill="F7F8FA" w:val="clear"/>
+            <w:tcMar>
+              <w:top w:type="dxa" w:w="80"/>
+              <w:left w:type="dxa" w:w="120"/>
+              <w:bottom w:type="dxa" w:w="80"/>
+              <w:right w:type="dxa" w:w="120"/>
+            </w:tcMar>
+          </w:tcPr>
+          <w:p>
+            <w:pPr>
+              <w:spacing w:after="0" w:line="252"/>
+              <w:jc w:val="center"/>
+            </w:pPr>
+            <w:r>
+              <w:rPr>
+                <w:sz w:val="18"/>
+                <w:szCs w:val="18"/>
+              </w:rPr>
+              <w:t xml:space="preserve">gpt-4o-mini</w:t>
+            </w:r>
+          </w:p>
+        </w:tc>
+        <w:tc>
+          <w:tcPr>
+            <w:tcW w:type="dxa" w:w="700"/>
+            <w:shd w:fill="F7F8FA" w:val="clear"/>
+            <w:tcMar>
+              <w:top w:type="dxa" w:w="80"/>
+              <w:left w:type="dxa" w:w="120"/>
+              <w:bottom w:type="dxa" w:w="80"/>
+              <w:right w:type="dxa" w:w="120"/>
+            </w:tcMar>
+          </w:tcPr>
+          <w:p>
+            <w:pPr>
+              <w:spacing w:after="0" w:line="252"/>
+              <w:jc w:val="center"/>
+            </w:pPr>
+            <w:r>
+              <w:rPr>
+                <w:sz w:val="18"/>
+                <w:szCs w:val="18"/>
+              </w:rPr>
+              <w:t xml:space="preserve">500</w:t>
+            </w:r>
+          </w:p>
+        </w:tc>
+        <w:tc>
+          <w:tcPr>
+            <w:tcW w:type="dxa" w:w="1476"/>
+            <w:shd w:fill="F7F8FA" w:val="clear"/>
+            <w:tcMar>
+              <w:top w:type="dxa" w:w="80"/>
+              <w:left w:type="dxa" w:w="120"/>
+              <w:bottom w:type="dxa" w:w="80"/>
+              <w:right w:type="dxa" w:w="120"/>
+            </w:tcMar>
+          </w:tcPr>
+          <w:p>
+            <w:pPr>
+              <w:spacing w:after="0" w:line="252"/>
+              <w:jc w:val="center"/>
+            </w:pPr>
+            <w:r>
+              <w:rPr>
+                <w:sz w:val="18"/>
+                <w:szCs w:val="18"/>
+              </w:rPr>
+              <w:t xml:space="preserve">11%</w:t>
+            </w:r>
+          </w:p>
+        </w:tc>
+        <w:tc>
+          <w:tcPr>
+            <w:tcW w:type="dxa" w:w="1450"/>
+            <w:shd w:fill="F7F8FA" w:val="clear"/>
+            <w:tcMar>
+              <w:top w:type="dxa" w:w="80"/>
+              <w:left w:type="dxa" w:w="120"/>
+              <w:bottom w:type="dxa" w:w="80"/>
+              <w:right w:type="dxa" w:w="120"/>
+            </w:tcMar>
+          </w:tcPr>
+          <w:p>
+            <w:pPr>
+              <w:spacing w:after="0" w:line="252"/>
+              <w:jc w:val="center"/>
+            </w:pPr>
+            <w:r>
+              <w:rPr>
+                <w:sz w:val="18"/>
+                <w:szCs w:val="18"/>
+              </w:rPr>
+              <w:t xml:space="preserve">13%</w:t>
+            </w:r>
+          </w:p>
+        </w:tc>
+        <w:tc>
+          <w:tcPr>
+            <w:tcW w:type="dxa" w:w="800"/>
+            <w:shd w:fill="F7F8FA" w:val="clear"/>
+            <w:tcMar>
+              <w:top w:type="dxa" w:w="80"/>
+              <w:left w:type="dxa" w:w="120"/>
+              <w:bottom w:type="dxa" w:w="80"/>
+              <w:right w:type="dxa" w:w="120"/>
+            </w:tcMar>
+          </w:tcPr>
+          <w:p>
+            <w:pPr>
+              <w:spacing w:after="0" w:line="252"/>
+              <w:jc w:val="center"/>
+            </w:pPr>
+            <w:r>
+              <w:rPr>
+                <w:sz w:val="18"/>
+                <w:szCs w:val="18"/>
+              </w:rPr>
+              <w:t xml:space="preserve">−10</w:t>
+            </w:r>
+          </w:p>
+        </w:tc>
+        <w:tc>
+          <w:tcPr>
+            <w:tcW w:type="dxa" w:w="1200"/>
+            <w:shd w:fill="F7F8FA" w:val="clear"/>
+            <w:tcMar>
+              <w:top w:type="dxa" w:w="80"/>
+              <w:left w:type="dxa" w:w="120"/>
+              <w:bottom w:type="dxa" w:w="80"/>
+              <w:right w:type="dxa" w:w="120"/>
+            </w:tcMar>
+          </w:tcPr>
+          <w:p>
+            <w:pPr>
+              <w:spacing w:after="0" w:line="252"/>
+              <w:jc w:val="center"/>
+            </w:pPr>
+            <w:r>
+              <w:rPr>
+                <w:sz w:val="18"/>
+                <w:szCs w:val="18"/>
+              </w:rPr>
+              <w:t xml:space="preserve">0.397</w:t>
+            </w:r>
+          </w:p>
+        </w:tc>
+      </w:tr>
+    </w:tbl>
+    <w:p>
+      <w:pPr>
+        <w:spacing w:after="120"/>
+      </w:pPr>
+    </w:p>
+    <w:p>
+      <w:pPr>
+        <w:spacing w:after="160" w:line="276"/>
+      </w:pPr>
+      <w:r>
+        <w:rPr>
+          <w:sz w:val="21"/>
+          <w:szCs w:val="21"/>
+        </w:rPr>
+        <w:t xml:space="preserve">Self-Refine never helps. It ranges from neutral (frontier, little to fix) to significantly harmful — on ProofWriter/Llama it significantly increases silent failure (16% → 38%, p = 0.000), and at full n the FOLIO/Llama accuracy damage is net −31. The falsification-gate result is now robust across the whole matrix. (gpt-4o Self-Refine on the synthetic datasets was omitted: gpt-4o already solves them, so there is no gap to close. One cell — ProofWriter × gpt-4o-mini — is a re-run in progress after a grounder hang, now fixed.)</w:t>
+      </w:r>
+    </w:p>
+    <w:p>
+      <w:pPr>
+        <w:pStyle w:val="Heading2"/>
+        <w:spacing w:after="140" w:before="260"/>
+      </w:pPr>
+      <w:r>
+        <w:rPr>
+          <w:b/>
+          <w:bCs/>
+          <w:color w:val="1F3864"/>
+          <w:sz w:val="25"/>
+          <w:szCs w:val="25"/>
+        </w:rPr>
+        <w:t xml:space="preserve">10.3 Internal reasoning: does confidence detect silent failure?</w:t>
+      </w:r>
+    </w:p>
+    <w:p>
+      <w:pPr>
+        <w:spacing w:after="120" w:line="276"/>
+      </w:pPr>
+      <w:r>
+        <w:rPr>
+          <w:sz w:val="21"/>
+          <w:szCs w:val="21"/>
+        </w:rPr>
+        <w:t xml:space="preserve">Token-level logprob confidence of the whole-story translation as a gold-label-free risk signal. AUROC for separating silent failures from correct among gradeable examples (0.5 = chance), clustered bootstrap CI.</w:t>
+      </w:r>
+    </w:p>
+    <w:tbl>
+      <w:tblPr>
+        <w:tblW w:type="dxa" w:w="9026"/>
+        <w:tblBorders>
+          <w:top w:val="single" w:color="auto" w:sz="4"/>
+          <w:left w:val="single" w:color="auto" w:sz="4"/>
+          <w:bottom w:val="single" w:color="auto" w:sz="4"/>
+          <w:right w:val="single" w:color="auto" w:sz="4"/>
+          <w:insideH w:val="single" w:color="auto" w:sz="4"/>
+          <w:insideV w:val="single" w:color="auto" w:sz="4"/>
+        </w:tblBorders>
+      </w:tblPr>
+      <w:tblGrid>
+        <w:gridCol w:w="1700"/>
+        <w:gridCol w:w="1700"/>
+        <w:gridCol w:w="1600"/>
+        <w:gridCol w:w="2126"/>
+        <w:gridCol w:w="1900"/>
+      </w:tblGrid>
+      <w:tr>
+        <w:trPr>
+          <w:tblHeader/>
+        </w:trPr>
+        <w:tc>
+          <w:tcPr>
+            <w:tcW w:type="dxa" w:w="1700"/>
+            <w:shd w:fill="1F3864" w:val="clear"/>
+            <w:tcMar>
+              <w:top w:type="dxa" w:w="90"/>
+              <w:left w:type="dxa" w:w="120"/>
+              <w:bottom w:type="dxa" w:w="90"/>
+              <w:right w:type="dxa" w:w="120"/>
+            </w:tcMar>
+          </w:tcPr>
+          <w:p>
+            <w:pPr>
+              <w:spacing w:after="0"/>
+            </w:pPr>
+            <w:r>
+              <w:rPr>
+                <w:b/>
+                <w:bCs/>
+                <w:color w:val="FFFFFF"/>
+                <w:sz w:val="17"/>
+                <w:szCs w:val="17"/>
+              </w:rPr>
+              <w:t xml:space="preserve">dataset</w:t>
+            </w:r>
+          </w:p>
+        </w:tc>
+        <w:tc>
+          <w:tcPr>
+            <w:tcW w:type="dxa" w:w="1700"/>
+            <w:shd w:fill="1F3864" w:val="clear"/>
+            <w:tcMar>
+              <w:top w:type="dxa" w:w="90"/>
+              <w:left w:type="dxa" w:w="120"/>
+              <w:bottom w:type="dxa" w:w="90"/>
+              <w:right w:type="dxa" w:w="120"/>
+            </w:tcMar>
+          </w:tcPr>
+          <w:p>
+            <w:pPr>
+              <w:spacing w:after="0"/>
+              <w:jc w:val="center"/>
+            </w:pPr>
+            <w:r>
+              <w:rPr>
+                <w:b/>
+                <w:bCs/>
+                <w:color w:val="FFFFFF"/>
+                <w:sz w:val="17"/>
+                <w:szCs w:val="17"/>
+              </w:rPr>
+              <w:t xml:space="preserve">model</w:t>
+            </w:r>
+          </w:p>
+        </w:tc>
+        <w:tc>
+          <w:tcPr>
+            <w:tcW w:type="dxa" w:w="1600"/>
+            <w:shd w:fill="1F3864" w:val="clear"/>
+            <w:tcMar>
+              <w:top w:type="dxa" w:w="90"/>
+              <w:left w:type="dxa" w:w="120"/>
+              <w:bottom w:type="dxa" w:w="90"/>
+              <w:right w:type="dxa" w:w="120"/>
+            </w:tcMar>
+          </w:tcPr>
+          <w:p>
+            <w:pPr>
+              <w:spacing w:after="0"/>
+              <w:jc w:val="center"/>
+            </w:pPr>
+            <w:r>
+              <w:rPr>
+                <w:b/>
+                <w:bCs/>
+                <w:color w:val="FFFFFF"/>
+                <w:sz w:val="17"/>
+                <w:szCs w:val="17"/>
+              </w:rPr>
+              <w:t xml:space="preserve">silent / n</w:t>
+            </w:r>
+          </w:p>
+        </w:tc>
+        <w:tc>
+          <w:tcPr>
+            <w:tcW w:type="dxa" w:w="2126"/>
+            <w:shd w:fill="1F3864" w:val="clear"/>
+            <w:tcMar>
+              <w:top w:type="dxa" w:w="90"/>
+              <w:left w:type="dxa" w:w="120"/>
+              <w:bottom w:type="dxa" w:w="90"/>
+              <w:right w:type="dxa" w:w="120"/>
+            </w:tcMar>
+          </w:tcPr>
+          <w:p>
+            <w:pPr>
+              <w:spacing w:after="0"/>
+              <w:jc w:val="center"/>
+            </w:pPr>
+            <w:r>
+              <w:rPr>
+                <w:b/>
+                <w:bCs/>
+                <w:color w:val="FFFFFF"/>
+                <w:sz w:val="17"/>
+                <w:szCs w:val="17"/>
+              </w:rPr>
+              <w:t xml:space="preserve">AUROC (mean logprob)</w:t>
+            </w:r>
+          </w:p>
+        </w:tc>
+        <w:tc>
+          <w:tcPr>
+            <w:tcW w:type="dxa" w:w="1900"/>
+            <w:shd w:fill="1F3864" w:val="clear"/>
+            <w:tcMar>
+              <w:top w:type="dxa" w:w="90"/>
+              <w:left w:type="dxa" w:w="120"/>
+              <w:bottom w:type="dxa" w:w="90"/>
+              <w:right w:type="dxa" w:w="120"/>
+            </w:tcMar>
+          </w:tcPr>
+          <w:p>
+            <w:pPr>
+              <w:spacing w:after="0"/>
+              <w:jc w:val="center"/>
+            </w:pPr>
+            <w:r>
+              <w:rPr>
+                <w:b/>
+                <w:bCs/>
+                <w:color w:val="FFFFFF"/>
+                <w:sz w:val="17"/>
+                <w:szCs w:val="17"/>
+              </w:rPr>
+              <w:t xml:space="preserve">flag top 20%: prec / recall</w:t>
+            </w:r>
+          </w:p>
+        </w:tc>
+      </w:tr>
+      <w:tr>
+        <w:tc>
+          <w:tcPr>
+            <w:tcW w:type="dxa" w:w="1700"/>
+            <w:shd w:fill="FFFFFF" w:val="clear"/>
+            <w:tcMar>
+              <w:top w:type="dxa" w:w="80"/>
+              <w:left w:type="dxa" w:w="120"/>
+              <w:bottom w:type="dxa" w:w="80"/>
+              <w:right w:type="dxa" w:w="120"/>
+            </w:tcMar>
+          </w:tcPr>
+          <w:p>
+            <w:pPr>
+              <w:spacing w:after="0" w:line="252"/>
+            </w:pPr>
+            <w:r>
+              <w:rPr>
+                <w:sz w:val="17"/>
+                <w:szCs w:val="17"/>
+              </w:rPr>
+              <w:t xml:space="preserve">prontoqa</w:t>
+            </w:r>
+          </w:p>
+        </w:tc>
+        <w:tc>
+          <w:tcPr>
+            <w:tcW w:type="dxa" w:w="1700"/>
+            <w:shd w:fill="FFFFFF" w:val="clear"/>
+            <w:tcMar>
+              <w:top w:type="dxa" w:w="80"/>
+              <w:left w:type="dxa" w:w="120"/>
+              <w:bottom w:type="dxa" w:w="80"/>
+              <w:right w:type="dxa" w:w="120"/>
+            </w:tcMar>
+          </w:tcPr>
+          <w:p>
+            <w:pPr>
+              <w:spacing w:after="0" w:line="252"/>
+              <w:jc w:val="center"/>
+            </w:pPr>
+            <w:r>
+              <w:rPr>
+                <w:sz w:val="17"/>
+                <w:szCs w:val="17"/>
+              </w:rPr>
+              <w:t xml:space="preserve">Llama-3.1-8B</w:t>
+            </w:r>
+          </w:p>
+        </w:tc>
+        <w:tc>
+          <w:tcPr>
+            <w:tcW w:type="dxa" w:w="1600"/>
+            <w:shd w:fill="FFFFFF" w:val="clear"/>
+            <w:tcMar>
+              <w:top w:type="dxa" w:w="80"/>
+              <w:left w:type="dxa" w:w="120"/>
+              <w:bottom w:type="dxa" w:w="80"/>
+              <w:right w:type="dxa" w:w="120"/>
+            </w:tcMar>
+          </w:tcPr>
+          <w:p>
+            <w:pPr>
+              <w:spacing w:after="0" w:line="252"/>
+              <w:jc w:val="center"/>
+            </w:pPr>
+            <w:r>
+              <w:rPr>
+                <w:sz w:val="17"/>
+                <w:szCs w:val="17"/>
+              </w:rPr>
+              <w:t xml:space="preserve">174 / 481</w:t>
+            </w:r>
+          </w:p>
+        </w:tc>
+        <w:tc>
+          <w:tcPr>
+            <w:tcW w:type="dxa" w:w="2126"/>
+            <w:shd w:fill="FFFFFF" w:val="clear"/>
+            <w:tcMar>
+              <w:top w:type="dxa" w:w="80"/>
+              <w:left w:type="dxa" w:w="120"/>
+              <w:bottom w:type="dxa" w:w="80"/>
+              <w:right w:type="dxa" w:w="120"/>
+            </w:tcMar>
+          </w:tcPr>
+          <w:p>
+            <w:pPr>
+              <w:spacing w:after="0" w:line="252"/>
+              <w:jc w:val="center"/>
+            </w:pPr>
+            <w:r>
+              <w:rPr>
+                <w:b/>
+                <w:bCs/>
+                <w:color w:val="1E6B34"/>
+                <w:sz w:val="17"/>
+                <w:szCs w:val="17"/>
+              </w:rPr>
+              <w:t xml:space="preserve">0.871 [0.84, 0.90]</w:t>
+            </w:r>
+          </w:p>
+        </w:tc>
+        <w:tc>
+          <w:tcPr>
+            <w:tcW w:type="dxa" w:w="1900"/>
+            <w:shd w:fill="FFFFFF" w:val="clear"/>
+            <w:tcMar>
+              <w:top w:type="dxa" w:w="80"/>
+              <w:left w:type="dxa" w:w="120"/>
+              <w:bottom w:type="dxa" w:w="80"/>
+              <w:right w:type="dxa" w:w="120"/>
+            </w:tcMar>
+          </w:tcPr>
+          <w:p>
+            <w:pPr>
+              <w:spacing w:after="0" w:line="252"/>
+              <w:jc w:val="center"/>
+            </w:pPr>
+            <w:r>
+              <w:rPr>
+                <w:sz w:val="17"/>
+                <w:szCs w:val="17"/>
+              </w:rPr>
+              <w:t xml:space="preserve">83.5% / 46.6%</w:t>
+            </w:r>
+          </w:p>
+        </w:tc>
+      </w:tr>
+      <w:tr>
+        <w:tc>
+          <w:tcPr>
+            <w:tcW w:type="dxa" w:w="1700"/>
+            <w:shd w:fill="F7F8FA" w:val="clear"/>
+            <w:tcMar>
+              <w:top w:type="dxa" w:w="80"/>
+              <w:left w:type="dxa" w:w="120"/>
+              <w:bottom w:type="dxa" w:w="80"/>
+              <w:right w:type="dxa" w:w="120"/>
+            </w:tcMar>
+          </w:tcPr>
+          <w:p>
+            <w:pPr>
+              <w:spacing w:after="0" w:line="252"/>
+            </w:pPr>
+            <w:r>
+              <w:rPr>
+                <w:sz w:val="17"/>
+                <w:szCs w:val="17"/>
+              </w:rPr>
+              <w:t xml:space="preserve">proofwriter</w:t>
+            </w:r>
+          </w:p>
+        </w:tc>
+        <w:tc>
+          <w:tcPr>
+            <w:tcW w:type="dxa" w:w="1700"/>
+            <w:shd w:fill="F7F8FA" w:val="clear"/>
+            <w:tcMar>
+              <w:top w:type="dxa" w:w="80"/>
+              <w:left w:type="dxa" w:w="120"/>
+              <w:bottom w:type="dxa" w:w="80"/>
+              <w:right w:type="dxa" w:w="120"/>
+            </w:tcMar>
+          </w:tcPr>
+          <w:p>
+            <w:pPr>
+              <w:spacing w:after="0" w:line="252"/>
+              <w:jc w:val="center"/>
+            </w:pPr>
+            <w:r>
+              <w:rPr>
+                <w:sz w:val="17"/>
+                <w:szCs w:val="17"/>
+              </w:rPr>
+              <w:t xml:space="preserve">Llama-3.1-8B</w:t>
+            </w:r>
+          </w:p>
+        </w:tc>
+        <w:tc>
+          <w:tcPr>
+            <w:tcW w:type="dxa" w:w="1600"/>
+            <w:shd w:fill="F7F8FA" w:val="clear"/>
+            <w:tcMar>
+              <w:top w:type="dxa" w:w="80"/>
+              <w:left w:type="dxa" w:w="120"/>
+              <w:bottom w:type="dxa" w:w="80"/>
+              <w:right w:type="dxa" w:w="120"/>
+            </w:tcMar>
+          </w:tcPr>
+          <w:p>
+            <w:pPr>
+              <w:spacing w:after="0" w:line="252"/>
+              <w:jc w:val="center"/>
+            </w:pPr>
+            <w:r>
+              <w:rPr>
+                <w:sz w:val="17"/>
+                <w:szCs w:val="17"/>
+              </w:rPr>
+              <w:t xml:space="preserve">85 / 585</w:t>
+            </w:r>
+          </w:p>
+        </w:tc>
+        <w:tc>
+          <w:tcPr>
+            <w:tcW w:type="dxa" w:w="2126"/>
+            <w:shd w:fill="F7F8FA" w:val="clear"/>
+            <w:tcMar>
+              <w:top w:type="dxa" w:w="80"/>
+              <w:left w:type="dxa" w:w="120"/>
+              <w:bottom w:type="dxa" w:w="80"/>
+              <w:right w:type="dxa" w:w="120"/>
+            </w:tcMar>
+          </w:tcPr>
+          <w:p>
+            <w:pPr>
+              <w:spacing w:after="0" w:line="252"/>
+              <w:jc w:val="center"/>
+            </w:pPr>
+            <w:r>
+              <w:rPr>
+                <w:sz w:val="17"/>
+                <w:szCs w:val="17"/>
+              </w:rPr>
+              <w:t xml:space="preserve">0.682 [0.62, 0.74]</w:t>
+            </w:r>
+          </w:p>
+        </w:tc>
+        <w:tc>
+          <w:tcPr>
+            <w:tcW w:type="dxa" w:w="1900"/>
+            <w:shd w:fill="F7F8FA" w:val="clear"/>
+            <w:tcMar>
+              <w:top w:type="dxa" w:w="80"/>
+              <w:left w:type="dxa" w:w="120"/>
+              <w:bottom w:type="dxa" w:w="80"/>
+              <w:right w:type="dxa" w:w="120"/>
+            </w:tcMar>
+          </w:tcPr>
+          <w:p>
+            <w:pPr>
+              <w:spacing w:after="0" w:line="252"/>
+              <w:jc w:val="center"/>
+            </w:pPr>
+            <w:r>
+              <w:rPr>
+                <w:sz w:val="17"/>
+                <w:szCs w:val="17"/>
+              </w:rPr>
+              <w:t xml:space="preserve">22.2% / 30.6%</w:t>
+            </w:r>
+          </w:p>
+        </w:tc>
+      </w:tr>
+      <w:tr>
+        <w:tc>
+          <w:tcPr>
+            <w:tcW w:type="dxa" w:w="1700"/>
+            <w:shd w:fill="FFFFFF" w:val="clear"/>
+            <w:tcMar>
+              <w:top w:type="dxa" w:w="80"/>
+              <w:left w:type="dxa" w:w="120"/>
+              <w:bottom w:type="dxa" w:w="80"/>
+              <w:right w:type="dxa" w:w="120"/>
+            </w:tcMar>
+          </w:tcPr>
+          <w:p>
+            <w:pPr>
+              <w:spacing w:after="0" w:line="252"/>
+            </w:pPr>
+            <w:r>
+              <w:rPr>
+                <w:sz w:val="17"/>
+                <w:szCs w:val="17"/>
+              </w:rPr>
+              <w:t xml:space="preserve">folio</w:t>
+            </w:r>
+          </w:p>
+        </w:tc>
+        <w:tc>
+          <w:tcPr>
+            <w:tcW w:type="dxa" w:w="1700"/>
+            <w:shd w:fill="FFFFFF" w:val="clear"/>
+            <w:tcMar>
+              <w:top w:type="dxa" w:w="80"/>
+              <w:left w:type="dxa" w:w="120"/>
+              <w:bottom w:type="dxa" w:w="80"/>
+              <w:right w:type="dxa" w:w="120"/>
+            </w:tcMar>
+          </w:tcPr>
+          <w:p>
+            <w:pPr>
+              <w:spacing w:after="0" w:line="252"/>
+              <w:jc w:val="center"/>
+            </w:pPr>
+            <w:r>
+              <w:rPr>
+                <w:sz w:val="17"/>
+                <w:szCs w:val="17"/>
+              </w:rPr>
+              <w:t xml:space="preserve">gpt-4o-mini</w:t>
+            </w:r>
+          </w:p>
+        </w:tc>
+        <w:tc>
+          <w:tcPr>
+            <w:tcW w:type="dxa" w:w="1600"/>
+            <w:shd w:fill="FFFFFF" w:val="clear"/>
+            <w:tcMar>
+              <w:top w:type="dxa" w:w="80"/>
+              <w:left w:type="dxa" w:w="120"/>
+              <w:bottom w:type="dxa" w:w="80"/>
+              <w:right w:type="dxa" w:w="120"/>
+            </w:tcMar>
+          </w:tcPr>
+          <w:p>
+            <w:pPr>
+              <w:spacing w:after="0" w:line="252"/>
+              <w:jc w:val="center"/>
+            </w:pPr>
+            <w:r>
+              <w:rPr>
+                <w:sz w:val="17"/>
+                <w:szCs w:val="17"/>
+              </w:rPr>
+              <w:t xml:space="preserve">71 / 184</w:t>
+            </w:r>
+          </w:p>
+        </w:tc>
+        <w:tc>
+          <w:tcPr>
+            <w:tcW w:type="dxa" w:w="2126"/>
+            <w:shd w:fill="FFFFFF" w:val="clear"/>
+            <w:tcMar>
+              <w:top w:type="dxa" w:w="80"/>
+              <w:left w:type="dxa" w:w="120"/>
+              <w:bottom w:type="dxa" w:w="80"/>
+              <w:right w:type="dxa" w:w="120"/>
+            </w:tcMar>
+          </w:tcPr>
+          <w:p>
+            <w:pPr>
+              <w:spacing w:after="0" w:line="252"/>
+              <w:jc w:val="center"/>
+            </w:pPr>
+            <w:r>
+              <w:rPr>
+                <w:b/>
+                <w:bCs/>
+                <w:color w:val="9C1F1F"/>
+                <w:sz w:val="17"/>
+                <w:szCs w:val="17"/>
+              </w:rPr>
+              <w:t xml:space="preserve">0.492 [0.40, 0.59]</w:t>
+            </w:r>
+          </w:p>
+        </w:tc>
+        <w:tc>
+          <w:tcPr>
+            <w:tcW w:type="dxa" w:w="1900"/>
+            <w:shd w:fill="FFFFFF" w:val="clear"/>
+            <w:tcMar>
+              <w:top w:type="dxa" w:w="80"/>
+              <w:left w:type="dxa" w:w="120"/>
+              <w:bottom w:type="dxa" w:w="80"/>
+              <w:right w:type="dxa" w:w="120"/>
+            </w:tcMar>
+          </w:tcPr>
+          <w:p>
+            <w:pPr>
+              <w:spacing w:after="0" w:line="252"/>
+              <w:jc w:val="center"/>
+            </w:pPr>
+            <w:r>
+              <w:rPr>
+                <w:sz w:val="17"/>
+                <w:szCs w:val="17"/>
+              </w:rPr>
+              <w:t xml:space="preserve">43.2% / 22.5%</w:t>
+            </w:r>
+          </w:p>
+        </w:tc>
+      </w:tr>
+      <w:tr>
+        <w:tc>
+          <w:tcPr>
+            <w:tcW w:type="dxa" w:w="1700"/>
+            <w:shd w:fill="F7F8FA" w:val="clear"/>
+            <w:tcMar>
+              <w:top w:type="dxa" w:w="80"/>
+              <w:left w:type="dxa" w:w="120"/>
+              <w:bottom w:type="dxa" w:w="80"/>
+              <w:right w:type="dxa" w:w="120"/>
+            </w:tcMar>
+          </w:tcPr>
+          <w:p>
+            <w:pPr>
+              <w:spacing w:after="0" w:line="252"/>
+            </w:pPr>
+            <w:r>
+              <w:rPr>
+                <w:sz w:val="17"/>
+                <w:szCs w:val="17"/>
+              </w:rPr>
+              <w:t xml:space="preserve">proofwriter</w:t>
+            </w:r>
+          </w:p>
+        </w:tc>
+        <w:tc>
+          <w:tcPr>
+            <w:tcW w:type="dxa" w:w="1700"/>
+            <w:shd w:fill="F7F8FA" w:val="clear"/>
+            <w:tcMar>
+              <w:top w:type="dxa" w:w="80"/>
+              <w:left w:type="dxa" w:w="120"/>
+              <w:bottom w:type="dxa" w:w="80"/>
+              <w:right w:type="dxa" w:w="120"/>
+            </w:tcMar>
+          </w:tcPr>
+          <w:p>
+            <w:pPr>
+              <w:spacing w:after="0" w:line="252"/>
+              <w:jc w:val="center"/>
+            </w:pPr>
+            <w:r>
+              <w:rPr>
+                <w:sz w:val="17"/>
+                <w:szCs w:val="17"/>
+              </w:rPr>
+              <w:t xml:space="preserve">gpt-4o</w:t>
+            </w:r>
+          </w:p>
+        </w:tc>
+        <w:tc>
+          <w:tcPr>
+            <w:tcW w:type="dxa" w:w="1600"/>
+            <w:shd w:fill="F7F8FA" w:val="clear"/>
+            <w:tcMar>
+              <w:top w:type="dxa" w:w="80"/>
+              <w:left w:type="dxa" w:w="120"/>
+              <w:bottom w:type="dxa" w:w="80"/>
+              <w:right w:type="dxa" w:w="120"/>
+            </w:tcMar>
+          </w:tcPr>
+          <w:p>
+            <w:pPr>
+              <w:spacing w:after="0" w:line="252"/>
+              <w:jc w:val="center"/>
+            </w:pPr>
+            <w:r>
+              <w:rPr>
+                <w:sz w:val="17"/>
+                <w:szCs w:val="17"/>
+              </w:rPr>
+              <w:t xml:space="preserve">17 / 600</w:t>
+            </w:r>
+          </w:p>
+        </w:tc>
+        <w:tc>
+          <w:tcPr>
+            <w:tcW w:type="dxa" w:w="2126"/>
+            <w:shd w:fill="F7F8FA" w:val="clear"/>
+            <w:tcMar>
+              <w:top w:type="dxa" w:w="80"/>
+              <w:left w:type="dxa" w:w="120"/>
+              <w:bottom w:type="dxa" w:w="80"/>
+              <w:right w:type="dxa" w:w="120"/>
+            </w:tcMar>
+          </w:tcPr>
+          <w:p>
+            <w:pPr>
+              <w:spacing w:after="0" w:line="252"/>
+              <w:jc w:val="center"/>
+            </w:pPr>
+            <w:r>
+              <w:rPr>
+                <w:sz w:val="17"/>
+                <w:szCs w:val="17"/>
+              </w:rPr>
+              <w:t xml:space="preserve">0.391 [0.24, 0.54]</w:t>
+            </w:r>
+          </w:p>
+        </w:tc>
+        <w:tc>
+          <w:tcPr>
+            <w:tcW w:type="dxa" w:w="1900"/>
+            <w:shd w:fill="F7F8FA" w:val="clear"/>
+            <w:tcMar>
+              <w:top w:type="dxa" w:w="80"/>
+              <w:left w:type="dxa" w:w="120"/>
+              <w:bottom w:type="dxa" w:w="80"/>
+              <w:right w:type="dxa" w:w="120"/>
+            </w:tcMar>
+          </w:tcPr>
+          <w:p>
+            <w:pPr>
+              <w:spacing w:after="0" w:line="252"/>
+              <w:jc w:val="center"/>
+            </w:pPr>
+            <w:r>
+              <w:rPr>
+                <w:sz w:val="17"/>
+                <w:szCs w:val="17"/>
+              </w:rPr>
+              <w:t xml:space="preserve">—</w:t>
+            </w:r>
+          </w:p>
+        </w:tc>
+      </w:tr>
+    </w:tbl>
+    <w:p>
+      <w:pPr>
+        <w:spacing w:after="120"/>
+      </w:pPr>
+    </w:p>
+    <w:tbl>
+      <w:tblPr>
+        <w:tblW w:type="dxa" w:w="9026"/>
+        <w:tblBorders>
+          <w:top w:val="single" w:color="B26B00" w:sz="2"/>
+          <w:left w:val="single" w:color="B26B00" w:sz="18"/>
+          <w:bottom w:val="single" w:color="B26B00" w:sz="2"/>
+          <w:right w:val="single" w:color="B26B00" w:sz="2"/>
+          <w:insideH w:val="none"/>
+          <w:insideV w:val="none"/>
+        </w:tblBorders>
+      </w:tblPr>
+      <w:tblGrid>
+        <w:gridCol w:w="9026"/>
+      </w:tblGrid>
+      <w:tr>
+        <w:tc>
+          <w:tcPr>
+            <w:tcW w:type="dxa" w:w="9026"/>
+            <w:shd w:fill="FFF4E5" w:val="clear"/>
+            <w:tcMar>
+              <w:top w:type="dxa" w:w="140"/>
+              <w:left w:type="dxa" w:w="200"/>
+              <w:bottom w:type="dxa" w:w="140"/>
+              <w:right w:type="dxa" w:w="200"/>
+            </w:tcMar>
+          </w:tcPr>
+          <w:p>
+            <w:pPr>
+              <w:spacing w:after="60"/>
+            </w:pPr>
+            <w:r>
+              <w:rPr>
+                <w:b/>
+                <w:bCs/>
+                <w:color w:val="B26B00"/>
+                <w:sz w:val="21"/>
+                <w:szCs w:val="21"/>
+              </w:rPr>
+              <w:t xml:space="preserve">Critical finding for the detector direction</w:t>
+            </w:r>
+          </w:p>
+          <w:p>
+            <w:pPr>
+              <w:spacing w:after="60" w:line="276"/>
+            </w:pPr>
+            <w:r>
+              <w:rPr>
+                <w:sz w:val="20"/>
+                <w:szCs w:val="20"/>
+              </w:rPr>
+              <w:t xml:space="preserve">Generation confidence is a strong silent-failure detector on synthetic reasoning with a weak model (PrOntoQA/Llama AUROC 0.87; flagging the least-confident 20% catches silent failures at 83.5% precision) — but it is at chance on naturalistic FOLIO (gpt-4o-mini AUROC 0.49).</w:t>
+            </w:r>
+          </w:p>
+          <w:p>
+            <w:pPr>
+              <w:spacing w:after="60" w:line="276"/>
+            </w:pPr>
+            <w:r>
+              <w:rPr>
+                <w:sz w:val="20"/>
+                <w:szCs w:val="20"/>
+              </w:rPr>
+              <w:t xml:space="preserve">Confidence works where the problem is capability-removable anyway, and fails exactly where the problem persists at frontier scale. A confidence-based detector is therefore not sufficient for the durable FOLIO case; the structural cross-fragment predicate-schema-consistency signals (Section 2) are the direction to pursue there, not raw generation confidence. This is a data-driven constraint on the detector design, established before building it.</w:t>
             </w:r>
           </w:p>
         </w:tc>

</xml_diff>

<commit_message>
Complete the Self-Refine matrix: add ProofWriter mini cell (net -79, p=0.0000)
</commit_message>
<xml_diff>
--- a/docs/CREST_Experimental_Record.docx
+++ b/docs/CREST_Experimental_Record.docx
@@ -11521,7 +11521,7 @@
                 <w:sz w:val="18"/>
                 <w:szCs w:val="18"/>
               </w:rPr>
-              <w:t xml:space="preserve">prontoqa</w:t>
+              <w:t xml:space="preserve">proofwriter</w:t>
             </w:r>
           </w:p>
         </w:tc>
@@ -11546,7 +11546,7 @@
                 <w:sz w:val="18"/>
                 <w:szCs w:val="18"/>
               </w:rPr>
-              <w:t xml:space="preserve">Llama-3.1-8B</w:t>
+              <w:t xml:space="preserve">gpt-4o-mini</w:t>
             </w:r>
           </w:p>
         </w:tc>
@@ -11571,7 +11571,7 @@
                 <w:sz w:val="18"/>
                 <w:szCs w:val="18"/>
               </w:rPr>
-              <w:t xml:space="preserve">100</w:t>
+              <w:t xml:space="preserve">600</w:t>
             </w:r>
           </w:p>
         </w:tc>
@@ -11596,7 +11596,7 @@
                 <w:sz w:val="18"/>
                 <w:szCs w:val="18"/>
               </w:rPr>
-              <w:t xml:space="preserve">40%</w:t>
+              <w:t xml:space="preserve">4%</w:t>
             </w:r>
           </w:p>
         </w:tc>
@@ -11621,7 +11621,7 @@
                 <w:sz w:val="18"/>
                 <w:szCs w:val="18"/>
               </w:rPr>
-              <w:t xml:space="preserve">39%</w:t>
+              <w:t xml:space="preserve">16%</w:t>
             </w:r>
           </w:p>
         </w:tc>
@@ -11643,10 +11643,13 @@
             </w:pPr>
             <w:r>
               <w:rPr>
+                <w:b/>
+                <w:bCs/>
+                <w:color w:val="9C1F1F"/>
                 <w:sz w:val="18"/>
                 <w:szCs w:val="18"/>
               </w:rPr>
-              <w:t xml:space="preserve">−5</w:t>
+              <w:t xml:space="preserve">−79</w:t>
             </w:r>
           </w:p>
         </w:tc>
@@ -11668,10 +11671,13 @@
             </w:pPr>
             <w:r>
               <w:rPr>
+                <w:b/>
+                <w:bCs/>
+                <w:color w:val="9C1F1F"/>
                 <w:sz w:val="18"/>
                 <w:szCs w:val="18"/>
               </w:rPr>
-              <w:t xml:space="preserve">0.392</w:t>
+              <w:t xml:space="preserve">0.000</w:t>
             </w:r>
           </w:p>
         </w:tc>
@@ -11722,7 +11728,7 @@
                 <w:sz w:val="18"/>
                 <w:szCs w:val="18"/>
               </w:rPr>
-              <w:t xml:space="preserve">gpt-4o-mini</w:t>
+              <w:t xml:space="preserve">Llama-3.1-8B</w:t>
             </w:r>
           </w:p>
         </w:tc>
@@ -11747,7 +11753,7 @@
                 <w:sz w:val="18"/>
                 <w:szCs w:val="18"/>
               </w:rPr>
-              <w:t xml:space="preserve">500</w:t>
+              <w:t xml:space="preserve">100</w:t>
             </w:r>
           </w:p>
         </w:tc>
@@ -11772,7 +11778,7 @@
                 <w:sz w:val="18"/>
                 <w:szCs w:val="18"/>
               </w:rPr>
-              <w:t xml:space="preserve">11%</w:t>
+              <w:t xml:space="preserve">40%</w:t>
             </w:r>
           </w:p>
         </w:tc>
@@ -11797,7 +11803,7 @@
                 <w:sz w:val="18"/>
                 <w:szCs w:val="18"/>
               </w:rPr>
-              <w:t xml:space="preserve">13%</w:t>
+              <w:t xml:space="preserve">39%</w:t>
             </w:r>
           </w:p>
         </w:tc>
@@ -11822,6 +11828,182 @@
                 <w:sz w:val="18"/>
                 <w:szCs w:val="18"/>
               </w:rPr>
+              <w:t xml:space="preserve">−5</w:t>
+            </w:r>
+          </w:p>
+        </w:tc>
+        <w:tc>
+          <w:tcPr>
+            <w:tcW w:type="dxa" w:w="1200"/>
+            <w:shd w:fill="F7F8FA" w:val="clear"/>
+            <w:tcMar>
+              <w:top w:type="dxa" w:w="80"/>
+              <w:left w:type="dxa" w:w="120"/>
+              <w:bottom w:type="dxa" w:w="80"/>
+              <w:right w:type="dxa" w:w="120"/>
+            </w:tcMar>
+          </w:tcPr>
+          <w:p>
+            <w:pPr>
+              <w:spacing w:after="0" w:line="252"/>
+              <w:jc w:val="center"/>
+            </w:pPr>
+            <w:r>
+              <w:rPr>
+                <w:sz w:val="18"/>
+                <w:szCs w:val="18"/>
+              </w:rPr>
+              <w:t xml:space="preserve">0.392</w:t>
+            </w:r>
+          </w:p>
+        </w:tc>
+      </w:tr>
+      <w:tr>
+        <w:tc>
+          <w:tcPr>
+            <w:tcW w:type="dxa" w:w="1750"/>
+            <w:shd w:fill="FFFFFF" w:val="clear"/>
+            <w:tcMar>
+              <w:top w:type="dxa" w:w="80"/>
+              <w:left w:type="dxa" w:w="120"/>
+              <w:bottom w:type="dxa" w:w="80"/>
+              <w:right w:type="dxa" w:w="120"/>
+            </w:tcMar>
+          </w:tcPr>
+          <w:p>
+            <w:pPr>
+              <w:spacing w:after="0" w:line="252"/>
+            </w:pPr>
+            <w:r>
+              <w:rPr>
+                <w:sz w:val="18"/>
+                <w:szCs w:val="18"/>
+              </w:rPr>
+              <w:t xml:space="preserve">prontoqa</w:t>
+            </w:r>
+          </w:p>
+        </w:tc>
+        <w:tc>
+          <w:tcPr>
+            <w:tcW w:type="dxa" w:w="1650"/>
+            <w:shd w:fill="FFFFFF" w:val="clear"/>
+            <w:tcMar>
+              <w:top w:type="dxa" w:w="80"/>
+              <w:left w:type="dxa" w:w="120"/>
+              <w:bottom w:type="dxa" w:w="80"/>
+              <w:right w:type="dxa" w:w="120"/>
+            </w:tcMar>
+          </w:tcPr>
+          <w:p>
+            <w:pPr>
+              <w:spacing w:after="0" w:line="252"/>
+              <w:jc w:val="center"/>
+            </w:pPr>
+            <w:r>
+              <w:rPr>
+                <w:sz w:val="18"/>
+                <w:szCs w:val="18"/>
+              </w:rPr>
+              <w:t xml:space="preserve">gpt-4o-mini</w:t>
+            </w:r>
+          </w:p>
+        </w:tc>
+        <w:tc>
+          <w:tcPr>
+            <w:tcW w:type="dxa" w:w="700"/>
+            <w:shd w:fill="FFFFFF" w:val="clear"/>
+            <w:tcMar>
+              <w:top w:type="dxa" w:w="80"/>
+              <w:left w:type="dxa" w:w="120"/>
+              <w:bottom w:type="dxa" w:w="80"/>
+              <w:right w:type="dxa" w:w="120"/>
+            </w:tcMar>
+          </w:tcPr>
+          <w:p>
+            <w:pPr>
+              <w:spacing w:after="0" w:line="252"/>
+              <w:jc w:val="center"/>
+            </w:pPr>
+            <w:r>
+              <w:rPr>
+                <w:sz w:val="18"/>
+                <w:szCs w:val="18"/>
+              </w:rPr>
+              <w:t xml:space="preserve">500</w:t>
+            </w:r>
+          </w:p>
+        </w:tc>
+        <w:tc>
+          <w:tcPr>
+            <w:tcW w:type="dxa" w:w="1476"/>
+            <w:shd w:fill="FFFFFF" w:val="clear"/>
+            <w:tcMar>
+              <w:top w:type="dxa" w:w="80"/>
+              <w:left w:type="dxa" w:w="120"/>
+              <w:bottom w:type="dxa" w:w="80"/>
+              <w:right w:type="dxa" w:w="120"/>
+            </w:tcMar>
+          </w:tcPr>
+          <w:p>
+            <w:pPr>
+              <w:spacing w:after="0" w:line="252"/>
+              <w:jc w:val="center"/>
+            </w:pPr>
+            <w:r>
+              <w:rPr>
+                <w:sz w:val="18"/>
+                <w:szCs w:val="18"/>
+              </w:rPr>
+              <w:t xml:space="preserve">11%</w:t>
+            </w:r>
+          </w:p>
+        </w:tc>
+        <w:tc>
+          <w:tcPr>
+            <w:tcW w:type="dxa" w:w="1450"/>
+            <w:shd w:fill="FFFFFF" w:val="clear"/>
+            <w:tcMar>
+              <w:top w:type="dxa" w:w="80"/>
+              <w:left w:type="dxa" w:w="120"/>
+              <w:bottom w:type="dxa" w:w="80"/>
+              <w:right w:type="dxa" w:w="120"/>
+            </w:tcMar>
+          </w:tcPr>
+          <w:p>
+            <w:pPr>
+              <w:spacing w:after="0" w:line="252"/>
+              <w:jc w:val="center"/>
+            </w:pPr>
+            <w:r>
+              <w:rPr>
+                <w:sz w:val="18"/>
+                <w:szCs w:val="18"/>
+              </w:rPr>
+              <w:t xml:space="preserve">13%</w:t>
+            </w:r>
+          </w:p>
+        </w:tc>
+        <w:tc>
+          <w:tcPr>
+            <w:tcW w:type="dxa" w:w="800"/>
+            <w:shd w:fill="FFFFFF" w:val="clear"/>
+            <w:tcMar>
+              <w:top w:type="dxa" w:w="80"/>
+              <w:left w:type="dxa" w:w="120"/>
+              <w:bottom w:type="dxa" w:w="80"/>
+              <w:right w:type="dxa" w:w="120"/>
+            </w:tcMar>
+          </w:tcPr>
+          <w:p>
+            <w:pPr>
+              <w:spacing w:after="0" w:line="252"/>
+              <w:jc w:val="center"/>
+            </w:pPr>
+            <w:r>
+              <w:rPr>
+                <w:sz w:val="18"/>
+                <w:szCs w:val="18"/>
+              </w:rPr>
               <w:t xml:space="preserve">−10</w:t>
             </w:r>
           </w:p>
@@ -11829,7 +12011,7 @@
         <w:tc>
           <w:tcPr>
             <w:tcW w:type="dxa" w:w="1200"/>
-            <w:shd w:fill="F7F8FA" w:val="clear"/>
+            <w:shd w:fill="FFFFFF" w:val="clear"/>
             <w:tcMar>
               <w:top w:type="dxa" w:w="80"/>
               <w:left w:type="dxa" w:w="120"/>
@@ -11867,7 +12049,7 @@
           <w:sz w:val="21"/>
           <w:szCs w:val="21"/>
         </w:rPr>
-        <w:t xml:space="preserve">Self-Refine never helps. It ranges from neutral (frontier, little to fix) to significantly harmful — on ProofWriter/Llama it significantly increases silent failure (16% → 38%, p = 0.000), and at full n the FOLIO/Llama accuracy damage is net −31. The falsification-gate result is now robust across the whole matrix. (gpt-4o Self-Refine on the synthetic datasets was omitted: gpt-4o already solves them, so there is no gap to close. One cell — ProofWriter × gpt-4o-mini — is a re-run in progress after a grounder hang, now fixed.)</w:t>
+        <w:t xml:space="preserve">Self-Refine never helps. It ranges from neutral (frontier, little to fix) to significantly harmful — on both ProofWriter cells it significantly increases silent failure (Llama 16% → 38% and gpt-4o-mini 4% → 16%, both p = 0.000), and at full n the FOLIO/Llama accuracy damage is net −31. The falsification-gate result is robust across the whole (complete) matrix. gpt-4o Self-Refine on the synthetic datasets was omitted by design: gpt-4o already solves them, so there is no gap to close.</w:t>
       </w:r>
     </w:p>
     <w:p>

</xml_diff>